<commit_message>
add general description in vision doc
</commit_message>
<xml_diff>
--- a/01-Documentation/01-Vision/Vision.docx
+++ b/01-Documentation/01-Vision/Vision.docx
@@ -2,14 +2,154 @@
 <file path=word/document.xml><?xml version="1.0" encoding="utf-8"?>
 <w:document xmlns:wpc="http://schemas.microsoft.com/office/word/2010/wordprocessingCanvas" xmlns:cx="http://schemas.microsoft.com/office/drawing/2014/chartex" xmlns:cx1="http://schemas.microsoft.com/office/drawing/2015/9/8/chartex" xmlns:cx2="http://schemas.microsoft.com/office/drawing/2015/10/21/chartex" xmlns:cx3="http://schemas.microsoft.com/office/drawing/2016/5/9/chartex" xmlns:cx4="http://schemas.microsoft.com/office/drawing/2016/5/10/chartex" xmlns:cx5="http://schemas.microsoft.com/office/drawing/2016/5/11/chartex" xmlns:cx6="http://schemas.microsoft.com/office/drawing/2016/5/12/chartex" xmlns:cx7="http://schemas.microsoft.com/office/drawing/2016/5/13/chartex" xmlns:cx8="http://schemas.microsoft.com/office/drawing/2016/5/14/chartex" xmlns:mc="http://schemas.openxmlformats.org/markup-compatibility/2006" xmlns:aink="http://schemas.microsoft.com/office/drawing/2016/ink" xmlns:am3d="http://schemas.microsoft.com/office/drawing/2017/model3d" xmlns:o="urn:schemas-microsoft-com:office:office" xmlns:oel="http://schemas.microsoft.com/office/2019/extlst" xmlns:r="http://schemas.openxmlformats.org/officeDocument/2006/relationships" xmlns:m="http://schemas.openxmlformats.org/officeDocument/2006/math" xmlns:v="urn:schemas-microsoft-com:vml" xmlns:wp14="http://schemas.microsoft.com/office/word/2010/wordprocessingDrawing" xmlns:wp="http://schemas.openxmlformats.org/drawingml/2006/wordprocessingDrawing" xmlns:w10="urn:schemas-microsoft-com:office:word" xmlns:w="http://schemas.openxmlformats.org/wordprocessingml/2006/main" xmlns:w14="http://schemas.microsoft.com/office/word/2010/wordml" xmlns:w15="http://schemas.microsoft.com/office/word/2012/wordml" xmlns:w16cex="http://schemas.microsoft.com/office/word/2018/wordml/cex" xmlns:w16cid="http://schemas.microsoft.com/office/word/2016/wordml/cid" xmlns:w16="http://schemas.microsoft.com/office/word/2018/wordml" xmlns:w16du="http://schemas.microsoft.com/office/word/2023/wordml/word16du" xmlns:w16sdtdh="http://schemas.microsoft.com/office/word/2020/wordml/sdtdatahash" xmlns:w16sdtfl="http://schemas.microsoft.com/office/word/2024/wordml/sdtformatlock" xmlns:w16se="http://schemas.microsoft.com/office/word/2015/wordml/symex" xmlns:wpg="http://schemas.microsoft.com/office/word/2010/wordprocessingGroup" xmlns:wpi="http://schemas.microsoft.com/office/word/2010/wordprocessingInk" xmlns:wne="http://schemas.microsoft.com/office/word/2006/wordml" xmlns:wps="http://schemas.microsoft.com/office/word/2010/wordprocessingShape" mc:Ignorable="w14 w15 w16se w16cid w16 w16cex w16sdtdh w16sdtfl w16du wp14">
   <w:body>
-    <w:p/>
+    <w:p>
+      <w:pPr>
+        <w:jc w:val="center"/>
+        <w:rPr>
+          <w:color w:val="124F1A" w:themeColor="accent3" w:themeShade="BF"/>
+          <w:sz w:val="28"/>
+          <w:szCs w:val="28"/>
+          <w:lang w:val="en-US"/>
+          <w14:textOutline w14:w="9525" w14:cap="rnd" w14:cmpd="sng" w14:algn="ctr">
+            <w14:solidFill>
+              <w14:schemeClr w14:val="accent6">
+                <w14:lumMod w14:val="50000"/>
+              </w14:schemeClr>
+            </w14:solidFill>
+            <w14:prstDash w14:val="solid"/>
+            <w14:bevel/>
+          </w14:textOutline>
+        </w:rPr>
+      </w:pPr>
+      <w:r>
+        <w:rPr>
+          <w:color w:val="124F1A" w:themeColor="accent3" w:themeShade="BF"/>
+          <w:sz w:val="28"/>
+          <w:szCs w:val="28"/>
+          <w:lang w:val="en-US"/>
+          <w14:textOutline w14:w="9525" w14:cap="rnd" w14:cmpd="sng" w14:algn="ctr">
+            <w14:solidFill>
+              <w14:schemeClr w14:val="accent6">
+                <w14:lumMod w14:val="50000"/>
+              </w14:schemeClr>
+            </w14:solidFill>
+            <w14:prstDash w14:val="solid"/>
+            <w14:bevel/>
+          </w14:textOutline>
+        </w:rPr>
+        <w:t>AGRO BRAIN IA</w:t>
+      </w:r>
+    </w:p>
+    <w:p>
+      <w:pPr>
+        <w:pStyle w:val="Heading1"/>
+        <w:rPr>
+          <w:sz w:val="36"/>
+          <w:szCs w:val="36"/>
+          <w:lang w:val="en-US"/>
+        </w:rPr>
+      </w:pPr>
+      <w:r>
+        <w:rPr>
+          <w:noProof/>
+          <w:sz w:val="36"/>
+          <w:szCs w:val="36"/>
+          <w:lang w:val="en-US"/>
+        </w:rPr>
+        <mc:AlternateContent>
+          <mc:Choice Requires="wps">
+            <w:drawing>
+              <wp:anchor distT="0" distB="0" distL="114300" distR="114300" simplePos="0" relativeHeight="251659264" behindDoc="0" locked="0" layoutInCell="1" allowOverlap="1" wp14:anchorId="4887A7A8" wp14:editId="3C09D91A">
+                <wp:simplePos x="0" y="0"/>
+                <wp:positionH relativeFrom="column">
+                  <wp:posOffset>1906052</wp:posOffset>
+                </wp:positionH>
+                <wp:positionV relativeFrom="paragraph">
+                  <wp:posOffset>356497</wp:posOffset>
+                </wp:positionV>
+                <wp:extent cx="4245886" cy="0"/>
+                <wp:effectExtent l="0" t="0" r="0" b="0"/>
+                <wp:wrapNone/>
+                <wp:docPr id="1642996303" name="Straight Connector 3"/>
+                <wp:cNvGraphicFramePr/>
+                <a:graphic xmlns:a="http://schemas.openxmlformats.org/drawingml/2006/main">
+                  <a:graphicData uri="http://schemas.microsoft.com/office/word/2010/wordprocessingShape">
+                    <wps:wsp>
+                      <wps:cNvCnPr/>
+                      <wps:spPr>
+                        <a:xfrm>
+                          <a:off x="0" y="0"/>
+                          <a:ext cx="4245886" cy="0"/>
+                        </a:xfrm>
+                        <a:prstGeom prst="line">
+                          <a:avLst/>
+                        </a:prstGeom>
+                        <a:ln>
+                          <a:solidFill>
+                            <a:schemeClr val="tx2">
+                              <a:lumMod val="75000"/>
+                              <a:lumOff val="25000"/>
+                            </a:schemeClr>
+                          </a:solidFill>
+                        </a:ln>
+                      </wps:spPr>
+                      <wps:style>
+                        <a:lnRef idx="1">
+                          <a:schemeClr val="accent1"/>
+                        </a:lnRef>
+                        <a:fillRef idx="0">
+                          <a:schemeClr val="accent1"/>
+                        </a:fillRef>
+                        <a:effectRef idx="0">
+                          <a:schemeClr val="accent1"/>
+                        </a:effectRef>
+                        <a:fontRef idx="minor">
+                          <a:schemeClr val="tx1"/>
+                        </a:fontRef>
+                      </wps:style>
+                      <wps:bodyPr/>
+                    </wps:wsp>
+                  </a:graphicData>
+                </a:graphic>
+                <wp14:sizeRelH relativeFrom="margin">
+                  <wp14:pctWidth>0</wp14:pctWidth>
+                </wp14:sizeRelH>
+              </wp:anchor>
+            </w:drawing>
+          </mc:Choice>
+          <mc:Fallback>
+            <w:pict>
+              <v:line w14:anchorId="72516A17" id="Straight Connector 3" o:spid="_x0000_s1026" style="position:absolute;z-index:251659264;visibility:visible;mso-wrap-style:square;mso-width-percent:0;mso-wrap-distance-left:9pt;mso-wrap-distance-top:0;mso-wrap-distance-right:9pt;mso-wrap-distance-bottom:0;mso-position-horizontal:absolute;mso-position-horizontal-relative:text;mso-position-vertical:absolute;mso-position-vertical-relative:text;mso-width-percent:0;mso-width-relative:margin" from="150.1pt,28.05pt" to="484.4pt,28.05pt" o:gfxdata="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" strokecolor="#215e99 [2431]" strokeweight=".5pt">
+                <v:stroke joinstyle="miter"/>
+              </v:line>
+            </w:pict>
+          </mc:Fallback>
+        </mc:AlternateContent>
+      </w:r>
+      <w:r>
+        <w:rPr>
+          <w:sz w:val="36"/>
+          <w:szCs w:val="36"/>
+          <w:lang w:val="en-US"/>
+        </w:rPr>
+        <w:t>General description</w:t>
+      </w:r>
+    </w:p>
+    <w:p>
+      <w:pPr>
+        <w:rPr>
+          <w:lang w:val="en-US"/>
+        </w:rPr>
+      </w:pPr>
+      <w:r>
+        <w:rPr>
+          <w:lang w:val="en-US"/>
+        </w:rPr>
+        <w:t>AgroBrain IA Is an intelligent platform designed for agribusiness that centralizes operational information, analyzes productivity indicators, and generates recommendations for decision-making</w:t>
+      </w:r>
+    </w:p>
     <w:sectPr>
-      <w:headerReference w:type="even" r:id="rId6"/>
-      <w:headerReference w:type="default" r:id="rId7"/>
-      <w:footerReference w:type="even" r:id="rId8"/>
-      <w:footerReference w:type="default" r:id="rId9"/>
-      <w:headerReference w:type="first" r:id="rId10"/>
-      <w:footerReference w:type="first" r:id="rId11"/>
+      <w:headerReference w:type="default" r:id="rId6"/>
       <w:pgSz w:w="11906" w:h="16838"/>
       <w:pgMar w:top="1417" w:right="1701" w:bottom="1417" w:left="1701" w:header="708" w:footer="708" w:gutter="0"/>
       <w:cols w:space="708"/>
@@ -44,36 +184,6 @@
 </w:endnotes>
 </file>
 
-<file path=word/footer1.xml><?xml version="1.0" encoding="utf-8"?>
-<w:ftr xmlns:wpc="http://schemas.microsoft.com/office/word/2010/wordprocessingCanvas" xmlns:cx="http://schemas.microsoft.com/office/drawing/2014/chartex" xmlns:cx1="http://schemas.microsoft.com/office/drawing/2015/9/8/chartex" xmlns:cx2="http://schemas.microsoft.com/office/drawing/2015/10/21/chartex" xmlns:cx3="http://schemas.microsoft.com/office/drawing/2016/5/9/chartex" xmlns:cx4="http://schemas.microsoft.com/office/drawing/2016/5/10/chartex" xmlns:cx5="http://schemas.microsoft.com/office/drawing/2016/5/11/chartex" xmlns:cx6="http://schemas.microsoft.com/office/drawing/2016/5/12/chartex" xmlns:cx7="http://schemas.microsoft.com/office/drawing/2016/5/13/chartex" xmlns:cx8="http://schemas.microsoft.com/office/drawing/2016/5/14/chartex" xmlns:mc="http://schemas.openxmlformats.org/markup-compatibility/2006" xmlns:aink="http://schemas.microsoft.com/office/drawing/2016/ink" xmlns:am3d="http://schemas.microsoft.com/office/drawing/2017/model3d" xmlns:o="urn:schemas-microsoft-com:office:office" xmlns:oel="http://schemas.microsoft.com/office/2019/extlst" xmlns:r="http://schemas.openxmlformats.org/officeDocument/2006/relationships" xmlns:m="http://schemas.openxmlformats.org/officeDocument/2006/math" xmlns:v="urn:schemas-microsoft-com:vml" xmlns:wp14="http://schemas.microsoft.com/office/word/2010/wordprocessingDrawing" xmlns:wp="http://schemas.openxmlformats.org/drawingml/2006/wordprocessingDrawing" xmlns:w10="urn:schemas-microsoft-com:office:word" xmlns:w="http://schemas.openxmlformats.org/wordprocessingml/2006/main" xmlns:w14="http://schemas.microsoft.com/office/word/2010/wordml" xmlns:w15="http://schemas.microsoft.com/office/word/2012/wordml" xmlns:w16cex="http://schemas.microsoft.com/office/word/2018/wordml/cex" xmlns:w16cid="http://schemas.microsoft.com/office/word/2016/wordml/cid" xmlns:w16="http://schemas.microsoft.com/office/word/2018/wordml" xmlns:w16du="http://schemas.microsoft.com/office/word/2023/wordml/word16du" xmlns:w16sdtdh="http://schemas.microsoft.com/office/word/2020/wordml/sdtdatahash" xmlns:w16sdtfl="http://schemas.microsoft.com/office/word/2024/wordml/sdtformatlock" xmlns:w16se="http://schemas.microsoft.com/office/word/2015/wordml/symex" xmlns:wpg="http://schemas.microsoft.com/office/word/2010/wordprocessingGroup" xmlns:wpi="http://schemas.microsoft.com/office/word/2010/wordprocessingInk" xmlns:wne="http://schemas.microsoft.com/office/word/2006/wordml" xmlns:wps="http://schemas.microsoft.com/office/word/2010/wordprocessingShape" mc:Ignorable="w14 w15 w16se w16cid w16 w16cex w16sdtdh w16sdtfl w16du wp14">
-  <w:p>
-    <w:pPr>
-      <w:pStyle w:val="Footer"/>
-    </w:pPr>
-  </w:p>
-</w:ftr>
-</file>
-
-<file path=word/footer2.xml><?xml version="1.0" encoding="utf-8"?>
-<w:ftr xmlns:wpc="http://schemas.microsoft.com/office/word/2010/wordprocessingCanvas" xmlns:cx="http://schemas.microsoft.com/office/drawing/2014/chartex" xmlns:cx1="http://schemas.microsoft.com/office/drawing/2015/9/8/chartex" xmlns:cx2="http://schemas.microsoft.com/office/drawing/2015/10/21/chartex" xmlns:cx3="http://schemas.microsoft.com/office/drawing/2016/5/9/chartex" xmlns:cx4="http://schemas.microsoft.com/office/drawing/2016/5/10/chartex" xmlns:cx5="http://schemas.microsoft.com/office/drawing/2016/5/11/chartex" xmlns:cx6="http://schemas.microsoft.com/office/drawing/2016/5/12/chartex" xmlns:cx7="http://schemas.microsoft.com/office/drawing/2016/5/13/chartex" xmlns:cx8="http://schemas.microsoft.com/office/drawing/2016/5/14/chartex" xmlns:mc="http://schemas.openxmlformats.org/markup-compatibility/2006" xmlns:aink="http://schemas.microsoft.com/office/drawing/2016/ink" xmlns:am3d="http://schemas.microsoft.com/office/drawing/2017/model3d" xmlns:o="urn:schemas-microsoft-com:office:office" xmlns:oel="http://schemas.microsoft.com/office/2019/extlst" xmlns:r="http://schemas.openxmlformats.org/officeDocument/2006/relationships" xmlns:m="http://schemas.openxmlformats.org/officeDocument/2006/math" xmlns:v="urn:schemas-microsoft-com:vml" xmlns:wp14="http://schemas.microsoft.com/office/word/2010/wordprocessingDrawing" xmlns:wp="http://schemas.openxmlformats.org/drawingml/2006/wordprocessingDrawing" xmlns:w10="urn:schemas-microsoft-com:office:word" xmlns:w="http://schemas.openxmlformats.org/wordprocessingml/2006/main" xmlns:w14="http://schemas.microsoft.com/office/word/2010/wordml" xmlns:w15="http://schemas.microsoft.com/office/word/2012/wordml" xmlns:w16cex="http://schemas.microsoft.com/office/word/2018/wordml/cex" xmlns:w16cid="http://schemas.microsoft.com/office/word/2016/wordml/cid" xmlns:w16="http://schemas.microsoft.com/office/word/2018/wordml" xmlns:w16du="http://schemas.microsoft.com/office/word/2023/wordml/word16du" xmlns:w16sdtdh="http://schemas.microsoft.com/office/word/2020/wordml/sdtdatahash" xmlns:w16sdtfl="http://schemas.microsoft.com/office/word/2024/wordml/sdtformatlock" xmlns:w16se="http://schemas.microsoft.com/office/word/2015/wordml/symex" xmlns:wpg="http://schemas.microsoft.com/office/word/2010/wordprocessingGroup" xmlns:wpi="http://schemas.microsoft.com/office/word/2010/wordprocessingInk" xmlns:wne="http://schemas.microsoft.com/office/word/2006/wordml" xmlns:wps="http://schemas.microsoft.com/office/word/2010/wordprocessingShape" mc:Ignorable="w14 w15 w16se w16cid w16 w16cex w16sdtdh w16sdtfl w16du wp14">
-  <w:p>
-    <w:pPr>
-      <w:pStyle w:val="Footer"/>
-    </w:pPr>
-  </w:p>
-</w:ftr>
-</file>
-
-<file path=word/footer3.xml><?xml version="1.0" encoding="utf-8"?>
-<w:ftr xmlns:wpc="http://schemas.microsoft.com/office/word/2010/wordprocessingCanvas" xmlns:cx="http://schemas.microsoft.com/office/drawing/2014/chartex" xmlns:cx1="http://schemas.microsoft.com/office/drawing/2015/9/8/chartex" xmlns:cx2="http://schemas.microsoft.com/office/drawing/2015/10/21/chartex" xmlns:cx3="http://schemas.microsoft.com/office/drawing/2016/5/9/chartex" xmlns:cx4="http://schemas.microsoft.com/office/drawing/2016/5/10/chartex" xmlns:cx5="http://schemas.microsoft.com/office/drawing/2016/5/11/chartex" xmlns:cx6="http://schemas.microsoft.com/office/drawing/2016/5/12/chartex" xmlns:cx7="http://schemas.microsoft.com/office/drawing/2016/5/13/chartex" xmlns:cx8="http://schemas.microsoft.com/office/drawing/2016/5/14/chartex" xmlns:mc="http://schemas.openxmlformats.org/markup-compatibility/2006" xmlns:aink="http://schemas.microsoft.com/office/drawing/2016/ink" xmlns:am3d="http://schemas.microsoft.com/office/drawing/2017/model3d" xmlns:o="urn:schemas-microsoft-com:office:office" xmlns:oel="http://schemas.microsoft.com/office/2019/extlst" xmlns:r="http://schemas.openxmlformats.org/officeDocument/2006/relationships" xmlns:m="http://schemas.openxmlformats.org/officeDocument/2006/math" xmlns:v="urn:schemas-microsoft-com:vml" xmlns:wp14="http://schemas.microsoft.com/office/word/2010/wordprocessingDrawing" xmlns:wp="http://schemas.openxmlformats.org/drawingml/2006/wordprocessingDrawing" xmlns:w10="urn:schemas-microsoft-com:office:word" xmlns:w="http://schemas.openxmlformats.org/wordprocessingml/2006/main" xmlns:w14="http://schemas.microsoft.com/office/word/2010/wordml" xmlns:w15="http://schemas.microsoft.com/office/word/2012/wordml" xmlns:w16cex="http://schemas.microsoft.com/office/word/2018/wordml/cex" xmlns:w16cid="http://schemas.microsoft.com/office/word/2016/wordml/cid" xmlns:w16="http://schemas.microsoft.com/office/word/2018/wordml" xmlns:w16du="http://schemas.microsoft.com/office/word/2023/wordml/word16du" xmlns:w16sdtdh="http://schemas.microsoft.com/office/word/2020/wordml/sdtdatahash" xmlns:w16sdtfl="http://schemas.microsoft.com/office/word/2024/wordml/sdtformatlock" xmlns:w16se="http://schemas.microsoft.com/office/word/2015/wordml/symex" xmlns:wpg="http://schemas.microsoft.com/office/word/2010/wordprocessingGroup" xmlns:wpi="http://schemas.microsoft.com/office/word/2010/wordprocessingInk" xmlns:wne="http://schemas.microsoft.com/office/word/2006/wordml" xmlns:wps="http://schemas.microsoft.com/office/word/2010/wordprocessingShape" mc:Ignorable="w14 w15 w16se w16cid w16 w16cex w16sdtdh w16sdtfl w16du wp14">
-  <w:p>
-    <w:pPr>
-      <w:pStyle w:val="Footer"/>
-    </w:pPr>
-  </w:p>
-</w:ftr>
-</file>
-
 <file path=word/footnotes.xml><?xml version="1.0" encoding="utf-8"?>
 <w:footnotes xmlns:wpc="http://schemas.microsoft.com/office/word/2010/wordprocessingCanvas" xmlns:cx="http://schemas.microsoft.com/office/drawing/2014/chartex" xmlns:cx1="http://schemas.microsoft.com/office/drawing/2015/9/8/chartex" xmlns:cx2="http://schemas.microsoft.com/office/drawing/2015/10/21/chartex" xmlns:cx3="http://schemas.microsoft.com/office/drawing/2016/5/9/chartex" xmlns:cx4="http://schemas.microsoft.com/office/drawing/2016/5/10/chartex" xmlns:cx5="http://schemas.microsoft.com/office/drawing/2016/5/11/chartex" xmlns:cx6="http://schemas.microsoft.com/office/drawing/2016/5/12/chartex" xmlns:cx7="http://schemas.microsoft.com/office/drawing/2016/5/13/chartex" xmlns:cx8="http://schemas.microsoft.com/office/drawing/2016/5/14/chartex" xmlns:mc="http://schemas.openxmlformats.org/markup-compatibility/2006" xmlns:aink="http://schemas.microsoft.com/office/drawing/2016/ink" xmlns:am3d="http://schemas.microsoft.com/office/drawing/2017/model3d" xmlns:o="urn:schemas-microsoft-com:office:office" xmlns:oel="http://schemas.microsoft.com/office/2019/extlst" xmlns:r="http://schemas.openxmlformats.org/officeDocument/2006/relationships" xmlns:m="http://schemas.openxmlformats.org/officeDocument/2006/math" xmlns:v="urn:schemas-microsoft-com:vml" xmlns:wp14="http://schemas.microsoft.com/office/word/2010/wordprocessingDrawing" xmlns:wp="http://schemas.openxmlformats.org/drawingml/2006/wordprocessingDrawing" xmlns:w10="urn:schemas-microsoft-com:office:word" xmlns:w="http://schemas.openxmlformats.org/wordprocessingml/2006/main" xmlns:w14="http://schemas.microsoft.com/office/word/2010/wordml" xmlns:w15="http://schemas.microsoft.com/office/word/2012/wordml" xmlns:w16cex="http://schemas.microsoft.com/office/word/2018/wordml/cex" xmlns:w16cid="http://schemas.microsoft.com/office/word/2016/wordml/cid" xmlns:w16="http://schemas.microsoft.com/office/word/2018/wordml" xmlns:w16du="http://schemas.microsoft.com/office/word/2023/wordml/word16du" xmlns:w16sdtdh="http://schemas.microsoft.com/office/word/2020/wordml/sdtdatahash" xmlns:w16sdtfl="http://schemas.microsoft.com/office/word/2024/wordml/sdtformatlock" xmlns:w16se="http://schemas.microsoft.com/office/word/2015/wordml/symex" xmlns:wpg="http://schemas.microsoft.com/office/word/2010/wordprocessingGroup" xmlns:wpi="http://schemas.microsoft.com/office/word/2010/wordprocessingInk" xmlns:wne="http://schemas.microsoft.com/office/word/2006/wordml" xmlns:wps="http://schemas.microsoft.com/office/word/2010/wordprocessingShape" mc:Ignorable="w14 w15 w16se w16cid w16 w16cex w16sdtdh w16sdtfl w16du wp14">
   <w:footnote w:type="separator" w:id="-1">
@@ -100,16 +210,6 @@
 </file>
 
 <file path=word/header1.xml><?xml version="1.0" encoding="utf-8"?>
-<w:hdr xmlns:wpc="http://schemas.microsoft.com/office/word/2010/wordprocessingCanvas" xmlns:cx="http://schemas.microsoft.com/office/drawing/2014/chartex" xmlns:cx1="http://schemas.microsoft.com/office/drawing/2015/9/8/chartex" xmlns:cx2="http://schemas.microsoft.com/office/drawing/2015/10/21/chartex" xmlns:cx3="http://schemas.microsoft.com/office/drawing/2016/5/9/chartex" xmlns:cx4="http://schemas.microsoft.com/office/drawing/2016/5/10/chartex" xmlns:cx5="http://schemas.microsoft.com/office/drawing/2016/5/11/chartex" xmlns:cx6="http://schemas.microsoft.com/office/drawing/2016/5/12/chartex" xmlns:cx7="http://schemas.microsoft.com/office/drawing/2016/5/13/chartex" xmlns:cx8="http://schemas.microsoft.com/office/drawing/2016/5/14/chartex" xmlns:mc="http://schemas.openxmlformats.org/markup-compatibility/2006" xmlns:aink="http://schemas.microsoft.com/office/drawing/2016/ink" xmlns:am3d="http://schemas.microsoft.com/office/drawing/2017/model3d" xmlns:o="urn:schemas-microsoft-com:office:office" xmlns:oel="http://schemas.microsoft.com/office/2019/extlst" xmlns:r="http://schemas.openxmlformats.org/officeDocument/2006/relationships" xmlns:m="http://schemas.openxmlformats.org/officeDocument/2006/math" xmlns:v="urn:schemas-microsoft-com:vml" xmlns:wp14="http://schemas.microsoft.com/office/word/2010/wordprocessingDrawing" xmlns:wp="http://schemas.openxmlformats.org/drawingml/2006/wordprocessingDrawing" xmlns:w10="urn:schemas-microsoft-com:office:word" xmlns:w="http://schemas.openxmlformats.org/wordprocessingml/2006/main" xmlns:w14="http://schemas.microsoft.com/office/word/2010/wordml" xmlns:w15="http://schemas.microsoft.com/office/word/2012/wordml" xmlns:w16cex="http://schemas.microsoft.com/office/word/2018/wordml/cex" xmlns:w16cid="http://schemas.microsoft.com/office/word/2016/wordml/cid" xmlns:w16="http://schemas.microsoft.com/office/word/2018/wordml" xmlns:w16du="http://schemas.microsoft.com/office/word/2023/wordml/word16du" xmlns:w16sdtdh="http://schemas.microsoft.com/office/word/2020/wordml/sdtdatahash" xmlns:w16sdtfl="http://schemas.microsoft.com/office/word/2024/wordml/sdtformatlock" xmlns:w16se="http://schemas.microsoft.com/office/word/2015/wordml/symex" xmlns:wpg="http://schemas.microsoft.com/office/word/2010/wordprocessingGroup" xmlns:wpi="http://schemas.microsoft.com/office/word/2010/wordprocessingInk" xmlns:wne="http://schemas.microsoft.com/office/word/2006/wordml" xmlns:wps="http://schemas.microsoft.com/office/word/2010/wordprocessingShape" mc:Ignorable="w14 w15 w16se w16cid w16 w16cex w16sdtdh w16sdtfl w16du wp14">
-  <w:p>
-    <w:pPr>
-      <w:pStyle w:val="Header"/>
-    </w:pPr>
-  </w:p>
-</w:hdr>
-</file>
-
-<file path=word/header2.xml><?xml version="1.0" encoding="utf-8"?>
 <w:hdr xmlns:wpc="http://schemas.microsoft.com/office/word/2010/wordprocessingCanvas" xmlns:cx="http://schemas.microsoft.com/office/drawing/2014/chartex" xmlns:cx1="http://schemas.microsoft.com/office/drawing/2015/9/8/chartex" xmlns:cx2="http://schemas.microsoft.com/office/drawing/2015/10/21/chartex" xmlns:cx3="http://schemas.microsoft.com/office/drawing/2016/5/9/chartex" xmlns:cx4="http://schemas.microsoft.com/office/drawing/2016/5/10/chartex" xmlns:cx5="http://schemas.microsoft.com/office/drawing/2016/5/11/chartex" xmlns:cx6="http://schemas.microsoft.com/office/drawing/2016/5/12/chartex" xmlns:cx7="http://schemas.microsoft.com/office/drawing/2016/5/13/chartex" xmlns:cx8="http://schemas.microsoft.com/office/drawing/2016/5/14/chartex" xmlns:mc="http://schemas.openxmlformats.org/markup-compatibility/2006" xmlns:aink="http://schemas.microsoft.com/office/drawing/2016/ink" xmlns:am3d="http://schemas.microsoft.com/office/drawing/2017/model3d" xmlns:o="urn:schemas-microsoft-com:office:office" xmlns:oel="http://schemas.microsoft.com/office/2019/extlst" xmlns:r="http://schemas.openxmlformats.org/officeDocument/2006/relationships" xmlns:m="http://schemas.openxmlformats.org/officeDocument/2006/math" xmlns:v="urn:schemas-microsoft-com:vml" xmlns:wp14="http://schemas.microsoft.com/office/word/2010/wordprocessingDrawing" xmlns:wp="http://schemas.openxmlformats.org/drawingml/2006/wordprocessingDrawing" xmlns:w10="urn:schemas-microsoft-com:office:word" xmlns:w="http://schemas.openxmlformats.org/wordprocessingml/2006/main" xmlns:w14="http://schemas.microsoft.com/office/word/2010/wordml" xmlns:w15="http://schemas.microsoft.com/office/word/2012/wordml" xmlns:w16cex="http://schemas.microsoft.com/office/word/2018/wordml/cex" xmlns:w16cid="http://schemas.microsoft.com/office/word/2016/wordml/cid" xmlns:w16="http://schemas.microsoft.com/office/word/2018/wordml" xmlns:w16du="http://schemas.microsoft.com/office/word/2023/wordml/word16du" xmlns:w16sdtdh="http://schemas.microsoft.com/office/word/2020/wordml/sdtdatahash" xmlns:w16sdtfl="http://schemas.microsoft.com/office/word/2024/wordml/sdtformatlock" xmlns:w16se="http://schemas.microsoft.com/office/word/2015/wordml/symex" xmlns:wpg="http://schemas.microsoft.com/office/word/2010/wordprocessingGroup" xmlns:wpi="http://schemas.microsoft.com/office/word/2010/wordprocessingInk" xmlns:wne="http://schemas.microsoft.com/office/word/2006/wordml" xmlns:wps="http://schemas.microsoft.com/office/word/2010/wordprocessingShape" mc:Ignorable="w14 w15 w16se w16cid w16 w16cex w16sdtdh w16sdtfl w16du wp14">
   <w:p>
     <w:pPr>
@@ -209,7 +309,7 @@
         </mc:Choice>
         <mc:Fallback>
           <w:pict>
-            <v:shapetype w14:anchorId="3C1E49F9" id="_x0000_t120" coordsize="21600,21600" o:spt="120" path="m10800,qx,10800,10800,21600,21600,10800,10800,xe">
+            <v:shapetype w14:anchorId="538D0C2B" id="_x0000_t120" coordsize="21600,21600" o:spt="120" path="m10800,qx,10800,10800,21600,21600,10800,10800,xe">
               <v:path gradientshapeok="t" o:connecttype="custom" o:connectlocs="10800,0;3163,3163;0,10800;3163,18437;10800,21600;18437,18437;21600,10800;18437,3163" textboxrect="3163,3163,18437,18437"/>
             </v:shapetype>
             <v:shape id="Flowchart: Connector 2" o:spid="_x0000_s1026" type="#_x0000_t120" style="position:absolute;margin-left:3.7pt;margin-top:-25.8pt;width:54.9pt;height:54.9pt;z-index:251659264;visibility:visible;mso-wrap-style:square;mso-width-percent:0;mso-height-percent:0;mso-wrap-distance-left:9pt;mso-wrap-distance-top:0;mso-wrap-distance-right:9pt;mso-wrap-distance-bottom:0;mso-position-horizontal:right;mso-position-horizontal-relative:left-margin-area;mso-position-vertical:absolute;mso-position-vertical-relative:text;mso-width-percent:0;mso-height-percent:0;mso-width-relative:margin;mso-height-relative:margin;v-text-anchor:middle" o:gfxdata="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" stroked="f" strokeweight="1pt">
@@ -237,16 +337,6 @@
       </w:rPr>
       <w:t xml:space="preserve"> </w:t>
     </w:r>
-  </w:p>
-</w:hdr>
-</file>
-
-<file path=word/header3.xml><?xml version="1.0" encoding="utf-8"?>
-<w:hdr xmlns:wpc="http://schemas.microsoft.com/office/word/2010/wordprocessingCanvas" xmlns:cx="http://schemas.microsoft.com/office/drawing/2014/chartex" xmlns:cx1="http://schemas.microsoft.com/office/drawing/2015/9/8/chartex" xmlns:cx2="http://schemas.microsoft.com/office/drawing/2015/10/21/chartex" xmlns:cx3="http://schemas.microsoft.com/office/drawing/2016/5/9/chartex" xmlns:cx4="http://schemas.microsoft.com/office/drawing/2016/5/10/chartex" xmlns:cx5="http://schemas.microsoft.com/office/drawing/2016/5/11/chartex" xmlns:cx6="http://schemas.microsoft.com/office/drawing/2016/5/12/chartex" xmlns:cx7="http://schemas.microsoft.com/office/drawing/2016/5/13/chartex" xmlns:cx8="http://schemas.microsoft.com/office/drawing/2016/5/14/chartex" xmlns:mc="http://schemas.openxmlformats.org/markup-compatibility/2006" xmlns:aink="http://schemas.microsoft.com/office/drawing/2016/ink" xmlns:am3d="http://schemas.microsoft.com/office/drawing/2017/model3d" xmlns:o="urn:schemas-microsoft-com:office:office" xmlns:oel="http://schemas.microsoft.com/office/2019/extlst" xmlns:r="http://schemas.openxmlformats.org/officeDocument/2006/relationships" xmlns:m="http://schemas.openxmlformats.org/officeDocument/2006/math" xmlns:v="urn:schemas-microsoft-com:vml" xmlns:wp14="http://schemas.microsoft.com/office/word/2010/wordprocessingDrawing" xmlns:wp="http://schemas.openxmlformats.org/drawingml/2006/wordprocessingDrawing" xmlns:w10="urn:schemas-microsoft-com:office:word" xmlns:w="http://schemas.openxmlformats.org/wordprocessingml/2006/main" xmlns:w14="http://schemas.microsoft.com/office/word/2010/wordml" xmlns:w15="http://schemas.microsoft.com/office/word/2012/wordml" xmlns:w16cex="http://schemas.microsoft.com/office/word/2018/wordml/cex" xmlns:w16cid="http://schemas.microsoft.com/office/word/2016/wordml/cid" xmlns:w16="http://schemas.microsoft.com/office/word/2018/wordml" xmlns:w16du="http://schemas.microsoft.com/office/word/2023/wordml/word16du" xmlns:w16sdtdh="http://schemas.microsoft.com/office/word/2020/wordml/sdtdatahash" xmlns:w16sdtfl="http://schemas.microsoft.com/office/word/2024/wordml/sdtformatlock" xmlns:w16se="http://schemas.microsoft.com/office/word/2015/wordml/symex" xmlns:wpg="http://schemas.microsoft.com/office/word/2010/wordprocessingGroup" xmlns:wpi="http://schemas.microsoft.com/office/word/2010/wordprocessingInk" xmlns:wne="http://schemas.microsoft.com/office/word/2006/wordml" xmlns:wps="http://schemas.microsoft.com/office/word/2010/wordprocessingShape" mc:Ignorable="w14 w15 w16se w16cid w16 w16cex w16sdtdh w16sdtfl w16du wp14">
-  <w:p>
-    <w:pPr>
-      <w:pStyle w:val="Header"/>
-    </w:pPr>
   </w:p>
 </w:hdr>
 </file>

</xml_diff>

<commit_message>
add new section in vision doc. - Problem and hoverwever
</commit_message>
<xml_diff>
--- a/01-Documentation/01-Vision/Vision.docx
+++ b/01-Documentation/01-Vision/Vision.docx
@@ -59,7 +59,7 @@
         <mc:AlternateContent>
           <mc:Choice Requires="wps">
             <w:drawing>
-              <wp:anchor distT="0" distB="0" distL="114300" distR="114300" simplePos="0" relativeHeight="251659264" behindDoc="0" locked="0" layoutInCell="1" allowOverlap="1" wp14:anchorId="4887A7A8" wp14:editId="3C09D91A">
+              <wp:anchor distT="0" distB="0" distL="114300" distR="114300" simplePos="0" relativeHeight="251659264" behindDoc="0" locked="0" layoutInCell="1" allowOverlap="1" wp14:anchorId="4887A7A8" wp14:editId="3A0722BE">
                 <wp:simplePos x="0" y="0"/>
                 <wp:positionH relativeFrom="column">
                   <wp:posOffset>1906052</wp:posOffset>
@@ -119,7 +119,7 @@
           </mc:Choice>
           <mc:Fallback>
             <w:pict>
-              <v:line w14:anchorId="72516A17" id="Straight Connector 3" o:spid="_x0000_s1026" style="position:absolute;z-index:251659264;visibility:visible;mso-wrap-style:square;mso-width-percent:0;mso-wrap-distance-left:9pt;mso-wrap-distance-top:0;mso-wrap-distance-right:9pt;mso-wrap-distance-bottom:0;mso-position-horizontal:absolute;mso-position-horizontal-relative:text;mso-position-vertical:absolute;mso-position-vertical-relative:text;mso-width-percent:0;mso-width-relative:margin" from="150.1pt,28.05pt" to="484.4pt,28.05pt" o:gfxdata="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" strokecolor="#215e99 [2431]" strokeweight=".5pt">
+              <v:line w14:anchorId="1AC75EE7" id="Straight Connector 3" o:spid="_x0000_s1026" style="position:absolute;z-index:251659264;visibility:visible;mso-wrap-style:square;mso-width-percent:0;mso-wrap-distance-left:9pt;mso-wrap-distance-top:0;mso-wrap-distance-right:9pt;mso-wrap-distance-bottom:0;mso-position-horizontal:absolute;mso-position-horizontal-relative:text;mso-position-vertical:absolute;mso-position-vertical-relative:text;mso-width-percent:0;mso-width-relative:margin" from="150.1pt,28.05pt" to="484.4pt,28.05pt" o:gfxdata="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" strokecolor="#215e99 [2431]" strokeweight=".5pt">
                 <v:stroke joinstyle="miter"/>
               </v:line>
             </w:pict>
@@ -148,8 +148,228 @@
         <w:t>AgroBrain IA Is an intelligent platform designed for agribusiness that centralizes operational information, analyzes productivity indicators, and generates recommendations for decision-making</w:t>
       </w:r>
     </w:p>
+    <w:p>
+      <w:pPr>
+        <w:rPr>
+          <w:lang w:val="en-US"/>
+        </w:rPr>
+      </w:pPr>
+      <w:r>
+        <w:rPr>
+          <w:lang w:val="en-US"/>
+        </w:rPr>
+        <w:t xml:space="preserve">The platform aims to reduce reliance on manual reports, improve operational visibility, and support supervisors and managers through data-driven analysis and recommendations </w:t>
+      </w:r>
+    </w:p>
+    <w:p>
+      <w:pPr>
+        <w:pStyle w:val="Heading1"/>
+        <w:rPr>
+          <w:lang w:val="en-US"/>
+        </w:rPr>
+      </w:pPr>
+      <w:r>
+        <w:rPr>
+          <w:noProof/>
+          <w:sz w:val="36"/>
+          <w:szCs w:val="36"/>
+          <w:lang w:val="en-US"/>
+        </w:rPr>
+        <mc:AlternateContent>
+          <mc:Choice Requires="wps">
+            <w:drawing>
+              <wp:anchor distT="0" distB="0" distL="114300" distR="114300" simplePos="0" relativeHeight="251661312" behindDoc="0" locked="0" layoutInCell="1" allowOverlap="1" wp14:anchorId="3E54638F" wp14:editId="1749CBC0">
+                <wp:simplePos x="0" y="0"/>
+                <wp:positionH relativeFrom="column">
+                  <wp:posOffset>991652</wp:posOffset>
+                </wp:positionH>
+                <wp:positionV relativeFrom="paragraph">
+                  <wp:posOffset>328704</wp:posOffset>
+                </wp:positionV>
+                <wp:extent cx="5083278" cy="0"/>
+                <wp:effectExtent l="0" t="0" r="0" b="0"/>
+                <wp:wrapNone/>
+                <wp:docPr id="1000657753" name="Straight Connector 3"/>
+                <wp:cNvGraphicFramePr/>
+                <a:graphic xmlns:a="http://schemas.openxmlformats.org/drawingml/2006/main">
+                  <a:graphicData uri="http://schemas.microsoft.com/office/word/2010/wordprocessingShape">
+                    <wps:wsp>
+                      <wps:cNvCnPr/>
+                      <wps:spPr>
+                        <a:xfrm>
+                          <a:off x="0" y="0"/>
+                          <a:ext cx="5083278" cy="0"/>
+                        </a:xfrm>
+                        <a:prstGeom prst="line">
+                          <a:avLst/>
+                        </a:prstGeom>
+                        <a:ln>
+                          <a:solidFill>
+                            <a:schemeClr val="tx2">
+                              <a:lumMod val="75000"/>
+                              <a:lumOff val="25000"/>
+                            </a:schemeClr>
+                          </a:solidFill>
+                        </a:ln>
+                      </wps:spPr>
+                      <wps:style>
+                        <a:lnRef idx="1">
+                          <a:schemeClr val="accent1"/>
+                        </a:lnRef>
+                        <a:fillRef idx="0">
+                          <a:schemeClr val="accent1"/>
+                        </a:fillRef>
+                        <a:effectRef idx="0">
+                          <a:schemeClr val="accent1"/>
+                        </a:effectRef>
+                        <a:fontRef idx="minor">
+                          <a:schemeClr val="tx1"/>
+                        </a:fontRef>
+                      </wps:style>
+                      <wps:bodyPr/>
+                    </wps:wsp>
+                  </a:graphicData>
+                </a:graphic>
+                <wp14:sizeRelH relativeFrom="margin">
+                  <wp14:pctWidth>0</wp14:pctWidth>
+                </wp14:sizeRelH>
+              </wp:anchor>
+            </w:drawing>
+          </mc:Choice>
+          <mc:Fallback>
+            <w:pict>
+              <v:line w14:anchorId="41B7189B" id="Straight Connector 3" o:spid="_x0000_s1026" style="position:absolute;z-index:251661312;visibility:visible;mso-wrap-style:square;mso-width-percent:0;mso-wrap-distance-left:9pt;mso-wrap-distance-top:0;mso-wrap-distance-right:9pt;mso-wrap-distance-bottom:0;mso-position-horizontal:absolute;mso-position-horizontal-relative:text;mso-position-vertical:absolute;mso-position-vertical-relative:text;mso-width-percent:0;mso-width-relative:margin" from="78.1pt,25.9pt" to="478.35pt,25.9pt" o:gfxdata="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" strokecolor="#215e99 [2431]" strokeweight=".5pt">
+                <v:stroke joinstyle="miter"/>
+              </v:line>
+            </w:pict>
+          </mc:Fallback>
+        </mc:AlternateContent>
+      </w:r>
+      <w:r>
+        <w:rPr>
+          <w:lang w:val="en-US"/>
+        </w:rPr>
+        <w:t xml:space="preserve">Problem </w:t>
+      </w:r>
+    </w:p>
+    <w:p>
+      <w:pPr>
+        <w:rPr>
+          <w:lang w:val="en-US"/>
+        </w:rPr>
+      </w:pPr>
+      <w:r>
+        <w:rPr>
+          <w:lang w:val="en-US"/>
+        </w:rPr>
+        <w:t>Agribusiness generates large amounts of information related to production, agricultural tasks, personnel, quality, and performance</w:t>
+      </w:r>
+    </w:p>
+    <w:p>
+      <w:pPr>
+        <w:rPr>
+          <w:lang w:val="en-US"/>
+        </w:rPr>
+      </w:pPr>
+      <w:r>
+        <w:rPr>
+          <w:lang w:val="en-US"/>
+        </w:rPr>
+        <w:t>However:</w:t>
+      </w:r>
+    </w:p>
+    <w:p>
+      <w:pPr>
+        <w:pStyle w:val="ListParagraph"/>
+        <w:numPr>
+          <w:ilvl w:val="0"/>
+          <w:numId w:val="1"/>
+        </w:numPr>
+        <w:rPr>
+          <w:lang w:val="en-US"/>
+        </w:rPr>
+      </w:pPr>
+      <w:r>
+        <w:rPr>
+          <w:lang w:val="en-US"/>
+        </w:rPr>
+        <w:t xml:space="preserve">The information is scarttered across multiple systems </w:t>
+      </w:r>
+    </w:p>
+    <w:p>
+      <w:pPr>
+        <w:pStyle w:val="ListParagraph"/>
+        <w:numPr>
+          <w:ilvl w:val="0"/>
+          <w:numId w:val="1"/>
+        </w:numPr>
+        <w:rPr>
+          <w:lang w:val="en-US"/>
+        </w:rPr>
+      </w:pPr>
+      <w:r>
+        <w:rPr>
+          <w:lang w:val="en-US"/>
+        </w:rPr>
+        <w:t>There are delays in generating reports</w:t>
+      </w:r>
+    </w:p>
+    <w:p>
+      <w:pPr>
+        <w:pStyle w:val="ListParagraph"/>
+        <w:numPr>
+          <w:ilvl w:val="0"/>
+          <w:numId w:val="1"/>
+        </w:numPr>
+        <w:rPr>
+          <w:lang w:val="en-US"/>
+        </w:rPr>
+      </w:pPr>
+      <w:r>
+        <w:rPr>
+          <w:lang w:val="en-US"/>
+        </w:rPr>
+        <w:t>User depend on analysts to obtain specific information</w:t>
+      </w:r>
+    </w:p>
+    <w:p>
+      <w:pPr>
+        <w:pStyle w:val="ListParagraph"/>
+        <w:numPr>
+          <w:ilvl w:val="0"/>
+          <w:numId w:val="1"/>
+        </w:numPr>
+        <w:rPr>
+          <w:lang w:val="en-US"/>
+        </w:rPr>
+      </w:pPr>
+      <w:r>
+        <w:rPr>
+          <w:lang w:val="en-US"/>
+        </w:rPr>
+        <w:t>Problems are often detected only after they have already occurred</w:t>
+      </w:r>
+    </w:p>
+    <w:p>
+      <w:pPr>
+        <w:pStyle w:val="ListParagraph"/>
+        <w:numPr>
+          <w:ilvl w:val="0"/>
+          <w:numId w:val="1"/>
+        </w:numPr>
+        <w:rPr>
+          <w:lang w:val="en-US"/>
+        </w:rPr>
+      </w:pPr>
+      <w:r>
+        <w:rPr>
+          <w:lang w:val="en-US"/>
+        </w:rPr>
+        <w:t>Decision-making relies primarily on staff experience</w:t>
+      </w:r>
+    </w:p>
     <w:sectPr>
-      <w:headerReference w:type="default" r:id="rId6"/>
+      <w:headerReference w:type="default" r:id="rId7"/>
       <w:pgSz w:w="11906" w:h="16838"/>
       <w:pgMar w:top="1417" w:right="1701" w:bottom="1417" w:left="1701" w:header="708" w:footer="708" w:gutter="0"/>
       <w:cols w:space="708"/>
@@ -309,7 +529,7 @@
         </mc:Choice>
         <mc:Fallback>
           <w:pict>
-            <v:shapetype w14:anchorId="538D0C2B" id="_x0000_t120" coordsize="21600,21600" o:spt="120" path="m10800,qx,10800,10800,21600,21600,10800,10800,xe">
+            <v:shapetype w14:anchorId="378FC393" id="_x0000_t120" coordsize="21600,21600" o:spt="120" path="m10800,qx,10800,10800,21600,21600,10800,10800,xe">
               <v:path gradientshapeok="t" o:connecttype="custom" o:connectlocs="10800,0;3163,3163;0,10800;3163,18437;10800,21600;18437,18437;21600,10800;18437,3163" textboxrect="3163,3163,18437,18437"/>
             </v:shapetype>
             <v:shape id="Flowchart: Connector 2" o:spid="_x0000_s1026" type="#_x0000_t120" style="position:absolute;margin-left:3.7pt;margin-top:-25.8pt;width:54.9pt;height:54.9pt;z-index:251659264;visibility:visible;mso-wrap-style:square;mso-width-percent:0;mso-height-percent:0;mso-wrap-distance-left:9pt;mso-wrap-distance-top:0;mso-wrap-distance-right:9pt;mso-wrap-distance-bottom:0;mso-position-horizontal:right;mso-position-horizontal-relative:left-margin-area;mso-position-vertical:absolute;mso-position-vertical-relative:text;mso-width-percent:0;mso-height-percent:0;mso-width-relative:margin;mso-height-relative:margin;v-text-anchor:middle" o:gfxdata="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" stroked="f" strokeweight="1pt">
@@ -339,6 +559,127 @@
     </w:r>
   </w:p>
 </w:hdr>
+</file>
+
+<file path=word/numbering.xml><?xml version="1.0" encoding="utf-8"?>
+<w:numbering xmlns:wpc="http://schemas.microsoft.com/office/word/2010/wordprocessingCanvas" xmlns:cx="http://schemas.microsoft.com/office/drawing/2014/chartex" xmlns:cx1="http://schemas.microsoft.com/office/drawing/2015/9/8/chartex" xmlns:cx2="http://schemas.microsoft.com/office/drawing/2015/10/21/chartex" xmlns:cx3="http://schemas.microsoft.com/office/drawing/2016/5/9/chartex" xmlns:cx4="http://schemas.microsoft.com/office/drawing/2016/5/10/chartex" xmlns:cx5="http://schemas.microsoft.com/office/drawing/2016/5/11/chartex" xmlns:cx6="http://schemas.microsoft.com/office/drawing/2016/5/12/chartex" xmlns:cx7="http://schemas.microsoft.com/office/drawing/2016/5/13/chartex" xmlns:cx8="http://schemas.microsoft.com/office/drawing/2016/5/14/chartex" xmlns:mc="http://schemas.openxmlformats.org/markup-compatibility/2006" xmlns:aink="http://schemas.microsoft.com/office/drawing/2016/ink" xmlns:am3d="http://schemas.microsoft.com/office/drawing/2017/model3d" xmlns:o="urn:schemas-microsoft-com:office:office" xmlns:oel="http://schemas.microsoft.com/office/2019/extlst" xmlns:r="http://schemas.openxmlformats.org/officeDocument/2006/relationships" xmlns:m="http://schemas.openxmlformats.org/officeDocument/2006/math" xmlns:v="urn:schemas-microsoft-com:vml" xmlns:wp14="http://schemas.microsoft.com/office/word/2010/wordprocessingDrawing" xmlns:wp="http://schemas.openxmlformats.org/drawingml/2006/wordprocessingDrawing" xmlns:w10="urn:schemas-microsoft-com:office:word" xmlns:w="http://schemas.openxmlformats.org/wordprocessingml/2006/main" xmlns:w14="http://schemas.microsoft.com/office/word/2010/wordml" xmlns:w15="http://schemas.microsoft.com/office/word/2012/wordml" xmlns:w16cex="http://schemas.microsoft.com/office/word/2018/wordml/cex" xmlns:w16cid="http://schemas.microsoft.com/office/word/2016/wordml/cid" xmlns:w16="http://schemas.microsoft.com/office/word/2018/wordml" xmlns:w16du="http://schemas.microsoft.com/office/word/2023/wordml/word16du" xmlns:w16sdtdh="http://schemas.microsoft.com/office/word/2020/wordml/sdtdatahash" xmlns:w16sdtfl="http://schemas.microsoft.com/office/word/2024/wordml/sdtformatlock" xmlns:w16se="http://schemas.microsoft.com/office/word/2015/wordml/symex" xmlns:wpg="http://schemas.microsoft.com/office/word/2010/wordprocessingGroup" xmlns:wpi="http://schemas.microsoft.com/office/word/2010/wordprocessingInk" xmlns:wne="http://schemas.microsoft.com/office/word/2006/wordml" xmlns:wps="http://schemas.microsoft.com/office/word/2010/wordprocessingShape" mc:Ignorable="w14 w15 w16se w16cid w16 w16cex w16sdtdh w16sdtfl w16du wp14">
+  <w:abstractNum w:abstractNumId="0" w15:restartNumberingAfterBreak="0">
+    <w:nsid w:val="224900D5"/>
+    <w:multiLevelType w:val="hybridMultilevel"/>
+    <w:tmpl w:val="3ADEA81A"/>
+    <w:lvl w:ilvl="0" w:tplc="0C0A0003">
+      <w:start w:val="1"/>
+      <w:numFmt w:val="bullet"/>
+      <w:lvlText w:val="o"/>
+      <w:lvlJc w:val="left"/>
+      <w:pPr>
+        <w:ind w:left="720" w:hanging="360"/>
+      </w:pPr>
+      <w:rPr>
+        <w:rFonts w:ascii="Courier New" w:hAnsi="Courier New" w:cs="Courier New" w:hint="default"/>
+      </w:rPr>
+    </w:lvl>
+    <w:lvl w:ilvl="1" w:tplc="0C0A0003">
+      <w:start w:val="1"/>
+      <w:numFmt w:val="bullet"/>
+      <w:lvlText w:val="o"/>
+      <w:lvlJc w:val="left"/>
+      <w:pPr>
+        <w:ind w:left="1440" w:hanging="360"/>
+      </w:pPr>
+      <w:rPr>
+        <w:rFonts w:ascii="Courier New" w:hAnsi="Courier New" w:cs="Courier New" w:hint="default"/>
+      </w:rPr>
+    </w:lvl>
+    <w:lvl w:ilvl="2" w:tplc="0C0A0005" w:tentative="1">
+      <w:start w:val="1"/>
+      <w:numFmt w:val="bullet"/>
+      <w:lvlText w:val=""/>
+      <w:lvlJc w:val="left"/>
+      <w:pPr>
+        <w:ind w:left="2160" w:hanging="360"/>
+      </w:pPr>
+      <w:rPr>
+        <w:rFonts w:ascii="Wingdings" w:hAnsi="Wingdings" w:hint="default"/>
+      </w:rPr>
+    </w:lvl>
+    <w:lvl w:ilvl="3" w:tplc="0C0A0001" w:tentative="1">
+      <w:start w:val="1"/>
+      <w:numFmt w:val="bullet"/>
+      <w:lvlText w:val=""/>
+      <w:lvlJc w:val="left"/>
+      <w:pPr>
+        <w:ind w:left="2880" w:hanging="360"/>
+      </w:pPr>
+      <w:rPr>
+        <w:rFonts w:ascii="Symbol" w:hAnsi="Symbol" w:hint="default"/>
+      </w:rPr>
+    </w:lvl>
+    <w:lvl w:ilvl="4" w:tplc="0C0A0003" w:tentative="1">
+      <w:start w:val="1"/>
+      <w:numFmt w:val="bullet"/>
+      <w:lvlText w:val="o"/>
+      <w:lvlJc w:val="left"/>
+      <w:pPr>
+        <w:ind w:left="3600" w:hanging="360"/>
+      </w:pPr>
+      <w:rPr>
+        <w:rFonts w:ascii="Courier New" w:hAnsi="Courier New" w:cs="Courier New" w:hint="default"/>
+      </w:rPr>
+    </w:lvl>
+    <w:lvl w:ilvl="5" w:tplc="0C0A0005" w:tentative="1">
+      <w:start w:val="1"/>
+      <w:numFmt w:val="bullet"/>
+      <w:lvlText w:val=""/>
+      <w:lvlJc w:val="left"/>
+      <w:pPr>
+        <w:ind w:left="4320" w:hanging="360"/>
+      </w:pPr>
+      <w:rPr>
+        <w:rFonts w:ascii="Wingdings" w:hAnsi="Wingdings" w:hint="default"/>
+      </w:rPr>
+    </w:lvl>
+    <w:lvl w:ilvl="6" w:tplc="0C0A0001" w:tentative="1">
+      <w:start w:val="1"/>
+      <w:numFmt w:val="bullet"/>
+      <w:lvlText w:val=""/>
+      <w:lvlJc w:val="left"/>
+      <w:pPr>
+        <w:ind w:left="5040" w:hanging="360"/>
+      </w:pPr>
+      <w:rPr>
+        <w:rFonts w:ascii="Symbol" w:hAnsi="Symbol" w:hint="default"/>
+      </w:rPr>
+    </w:lvl>
+    <w:lvl w:ilvl="7" w:tplc="0C0A0003" w:tentative="1">
+      <w:start w:val="1"/>
+      <w:numFmt w:val="bullet"/>
+      <w:lvlText w:val="o"/>
+      <w:lvlJc w:val="left"/>
+      <w:pPr>
+        <w:ind w:left="5760" w:hanging="360"/>
+      </w:pPr>
+      <w:rPr>
+        <w:rFonts w:ascii="Courier New" w:hAnsi="Courier New" w:cs="Courier New" w:hint="default"/>
+      </w:rPr>
+    </w:lvl>
+    <w:lvl w:ilvl="8" w:tplc="0C0A0005" w:tentative="1">
+      <w:start w:val="1"/>
+      <w:numFmt w:val="bullet"/>
+      <w:lvlText w:val=""/>
+      <w:lvlJc w:val="left"/>
+      <w:pPr>
+        <w:ind w:left="6480" w:hanging="360"/>
+      </w:pPr>
+      <w:rPr>
+        <w:rFonts w:ascii="Wingdings" w:hAnsi="Wingdings" w:hint="default"/>
+      </w:rPr>
+    </w:lvl>
+  </w:abstractNum>
+  <w:num w:numId="1" w16cid:durableId="201603446">
+    <w:abstractNumId w:val="0"/>
+  </w:num>
+</w:numbering>
 </file>
 
 <file path=word/styles.xml><?xml version="1.0" encoding="utf-8"?>

</xml_diff>

<commit_message>
add document in PDF format
</commit_message>
<xml_diff>
--- a/01-Documentation/01-Vision/Vision.docx
+++ b/01-Documentation/01-Vision/Vision.docx
@@ -141,11 +141,19 @@
           <w:lang w:val="en-US"/>
         </w:rPr>
       </w:pPr>
-      <w:r>
-        <w:rPr>
-          <w:lang w:val="en-US"/>
-        </w:rPr>
-        <w:t>AgroBrain IA Is an intelligent platform designed for agribusiness that centralizes operational information, analyzes productivity indicators, and generates recommendations for decision-making</w:t>
+      <w:proofErr w:type="spellStart"/>
+      <w:r>
+        <w:rPr>
+          <w:lang w:val="en-US"/>
+        </w:rPr>
+        <w:t>AgroBrain</w:t>
+      </w:r>
+      <w:proofErr w:type="spellEnd"/>
+      <w:r>
+        <w:rPr>
+          <w:lang w:val="en-US"/>
+        </w:rPr>
+        <w:t xml:space="preserve"> IA Is an intelligent platform designed for agribusiness that centralizes operational information, analyzes productivity indicators, and generates recommendations for decision-making</w:t>
       </w:r>
     </w:p>
     <w:p>
@@ -293,7 +301,21 @@
         <w:rPr>
           <w:lang w:val="en-US"/>
         </w:rPr>
-        <w:t xml:space="preserve">The information is scarttered across multiple systems </w:t>
+        <w:t xml:space="preserve">The information is </w:t>
+      </w:r>
+      <w:proofErr w:type="spellStart"/>
+      <w:r>
+        <w:rPr>
+          <w:lang w:val="en-US"/>
+        </w:rPr>
+        <w:t>scarttered</w:t>
+      </w:r>
+      <w:proofErr w:type="spellEnd"/>
+      <w:r>
+        <w:rPr>
+          <w:lang w:val="en-US"/>
+        </w:rPr>
+        <w:t xml:space="preserve"> across multiple systems </w:t>
       </w:r>
     </w:p>
     <w:p>
@@ -325,11 +347,19 @@
           <w:lang w:val="en-US"/>
         </w:rPr>
       </w:pPr>
-      <w:r>
-        <w:rPr>
-          <w:lang w:val="en-US"/>
-        </w:rPr>
-        <w:t>User depend on analysts to obtain specific information</w:t>
+      <w:proofErr w:type="gramStart"/>
+      <w:r>
+        <w:rPr>
+          <w:lang w:val="en-US"/>
+        </w:rPr>
+        <w:t>User</w:t>
+      </w:r>
+      <w:proofErr w:type="gramEnd"/>
+      <w:r>
+        <w:rPr>
+          <w:lang w:val="en-US"/>
+        </w:rPr>
+        <w:t xml:space="preserve"> depend on analysts to obtain specific information</w:t>
       </w:r>
     </w:p>
     <w:p>
@@ -537,6 +567,7 @@
     </w:p>
     <w:sectPr>
       <w:headerReference w:type="default" r:id="rId8"/>
+      <w:footerReference w:type="default" r:id="rId9"/>
       <w:pgSz w:w="11906" w:h="16838"/>
       <w:pgMar w:top="1417" w:right="1701" w:bottom="1417" w:left="1701" w:header="708" w:footer="708" w:gutter="0"/>
       <w:cols w:space="708"/>
@@ -569,6 +600,146 @@
     </w:p>
   </w:endnote>
 </w:endnotes>
+</file>
+
+<file path=word/footer1.xml><?xml version="1.0" encoding="utf-8"?>
+<w:ftr xmlns:wpc="http://schemas.microsoft.com/office/word/2010/wordprocessingCanvas" xmlns:cx="http://schemas.microsoft.com/office/drawing/2014/chartex" xmlns:cx1="http://schemas.microsoft.com/office/drawing/2015/9/8/chartex" xmlns:cx2="http://schemas.microsoft.com/office/drawing/2015/10/21/chartex" xmlns:cx3="http://schemas.microsoft.com/office/drawing/2016/5/9/chartex" xmlns:cx4="http://schemas.microsoft.com/office/drawing/2016/5/10/chartex" xmlns:cx5="http://schemas.microsoft.com/office/drawing/2016/5/11/chartex" xmlns:cx6="http://schemas.microsoft.com/office/drawing/2016/5/12/chartex" xmlns:cx7="http://schemas.microsoft.com/office/drawing/2016/5/13/chartex" xmlns:cx8="http://schemas.microsoft.com/office/drawing/2016/5/14/chartex" xmlns:mc="http://schemas.openxmlformats.org/markup-compatibility/2006" xmlns:aink="http://schemas.microsoft.com/office/drawing/2016/ink" xmlns:am3d="http://schemas.microsoft.com/office/drawing/2017/model3d" xmlns:o="urn:schemas-microsoft-com:office:office" xmlns:oel="http://schemas.microsoft.com/office/2019/extlst" xmlns:r="http://schemas.openxmlformats.org/officeDocument/2006/relationships" xmlns:m="http://schemas.openxmlformats.org/officeDocument/2006/math" xmlns:v="urn:schemas-microsoft-com:vml" xmlns:wp14="http://schemas.microsoft.com/office/word/2010/wordprocessingDrawing" xmlns:wp="http://schemas.openxmlformats.org/drawingml/2006/wordprocessingDrawing" xmlns:w10="urn:schemas-microsoft-com:office:word" xmlns:w="http://schemas.openxmlformats.org/wordprocessingml/2006/main" xmlns:w14="http://schemas.microsoft.com/office/word/2010/wordml" xmlns:w15="http://schemas.microsoft.com/office/word/2012/wordml" xmlns:w16cex="http://schemas.microsoft.com/office/word/2018/wordml/cex" xmlns:w16cid="http://schemas.microsoft.com/office/word/2016/wordml/cid" xmlns:w16="http://schemas.microsoft.com/office/word/2018/wordml" xmlns:w16du="http://schemas.microsoft.com/office/word/2023/wordml/word16du" xmlns:w16sdtdh="http://schemas.microsoft.com/office/word/2020/wordml/sdtdatahash" xmlns:w16sdtfl="http://schemas.microsoft.com/office/word/2024/wordml/sdtformatlock" xmlns:w16se="http://schemas.microsoft.com/office/word/2015/wordml/symex" xmlns:wpg="http://schemas.microsoft.com/office/word/2010/wordprocessingGroup" xmlns:wpi="http://schemas.microsoft.com/office/word/2010/wordprocessingInk" xmlns:wne="http://schemas.microsoft.com/office/word/2006/wordml" xmlns:wps="http://schemas.microsoft.com/office/word/2010/wordprocessingShape" mc:Ignorable="w14 w15 w16se w16cid w16 w16cex w16sdtdh w16sdtfl w16du wp14">
+  <w:tbl>
+    <w:tblPr>
+      <w:tblW w:w="5000" w:type="pct"/>
+      <w:tblCellMar>
+        <w:left w:w="0" w:type="dxa"/>
+        <w:right w:w="0" w:type="dxa"/>
+      </w:tblCellMar>
+      <w:tblLook w:val="04A0" w:firstRow="1" w:lastRow="0" w:firstColumn="1" w:lastColumn="0" w:noHBand="0" w:noVBand="1"/>
+    </w:tblPr>
+    <w:tblGrid>
+      <w:gridCol w:w="4084"/>
+      <w:gridCol w:w="340"/>
+      <w:gridCol w:w="4080"/>
+    </w:tblGrid>
+    <w:tr>
+      <w:tc>
+        <w:tcPr>
+          <w:tcW w:w="2401" w:type="pct"/>
+        </w:tcPr>
+        <w:p>
+          <w:pPr>
+            <w:pStyle w:val="Footer"/>
+            <w:rPr>
+              <w:caps/>
+              <w:color w:val="156082" w:themeColor="accent1"/>
+              <w:sz w:val="18"/>
+              <w:szCs w:val="18"/>
+            </w:rPr>
+          </w:pPr>
+          <w:sdt>
+            <w:sdtPr>
+              <w:rPr>
+                <w:caps/>
+                <w:color w:val="156082" w:themeColor="accent1"/>
+                <w:sz w:val="18"/>
+                <w:szCs w:val="18"/>
+              </w:rPr>
+              <w:alias w:val="Title"/>
+              <w:tag w:val=""/>
+              <w:id w:val="886384654"/>
+              <w:placeholder>
+                <w:docPart w:val="F3ECC9466D38496C8C62ECC747630D9F"/>
+              </w:placeholder>
+              <w:dataBinding w:prefixMappings="xmlns:ns0='http://purl.org/dc/elements/1.1/' xmlns:ns1='http://schemas.openxmlformats.org/package/2006/metadata/core-properties' " w:xpath="/ns1:coreProperties[1]/ns0:title[1]" w:storeItemID="{6C3C8BC8-F283-45AE-878A-BAB7291924A1}"/>
+              <w:text/>
+            </w:sdtPr>
+            <w:sdtContent>
+              <w:r>
+                <w:rPr>
+                  <w:caps/>
+                  <w:color w:val="156082" w:themeColor="accent1"/>
+                  <w:sz w:val="18"/>
+                  <w:szCs w:val="18"/>
+                </w:rPr>
+                <w:t>Agrobrain ia - confidential</w:t>
+              </w:r>
+            </w:sdtContent>
+          </w:sdt>
+        </w:p>
+      </w:tc>
+      <w:tc>
+        <w:tcPr>
+          <w:tcW w:w="200" w:type="pct"/>
+        </w:tcPr>
+        <w:p>
+          <w:pPr>
+            <w:pStyle w:val="Footer"/>
+            <w:rPr>
+              <w:caps/>
+              <w:color w:val="156082" w:themeColor="accent1"/>
+              <w:sz w:val="18"/>
+              <w:szCs w:val="18"/>
+            </w:rPr>
+          </w:pPr>
+        </w:p>
+      </w:tc>
+      <w:tc>
+        <w:tcPr>
+          <w:tcW w:w="2402" w:type="pct"/>
+        </w:tcPr>
+        <w:sdt>
+          <w:sdtPr>
+            <w:rPr>
+              <w:caps/>
+              <w:color w:val="156082" w:themeColor="accent1"/>
+              <w:sz w:val="18"/>
+              <w:szCs w:val="18"/>
+              <w:lang w:val="en-US"/>
+            </w:rPr>
+            <w:alias w:val="Author"/>
+            <w:tag w:val=""/>
+            <w:id w:val="1205441952"/>
+            <w:placeholder>
+              <w:docPart w:val="D111653F56F44416BC22023DDDC8FA6E"/>
+            </w:placeholder>
+            <w:dataBinding w:prefixMappings="xmlns:ns0='http://purl.org/dc/elements/1.1/' xmlns:ns1='http://schemas.openxmlformats.org/package/2006/metadata/core-properties' " w:xpath="/ns1:coreProperties[1]/ns0:creator[1]" w:storeItemID="{6C3C8BC8-F283-45AE-878A-BAB7291924A1}"/>
+            <w:text/>
+          </w:sdtPr>
+          <w:sdtContent>
+            <w:p>
+              <w:pPr>
+                <w:pStyle w:val="Footer"/>
+                <w:jc w:val="right"/>
+                <w:rPr>
+                  <w:caps/>
+                  <w:color w:val="156082" w:themeColor="accent1"/>
+                  <w:sz w:val="18"/>
+                  <w:szCs w:val="18"/>
+                  <w:lang w:val="en-US"/>
+                </w:rPr>
+              </w:pPr>
+              <w:r>
+                <w:rPr>
+                  <w:caps/>
+                  <w:color w:val="156082" w:themeColor="accent1"/>
+                  <w:sz w:val="18"/>
+                  <w:szCs w:val="18"/>
+                  <w:lang w:val="en-US"/>
+                </w:rPr>
+                <w:t>pi76141530 (Pulache Carreño, Job Isai)</w:t>
+              </w:r>
+            </w:p>
+          </w:sdtContent>
+        </w:sdt>
+      </w:tc>
+    </w:tr>
+  </w:tbl>
+  <w:p>
+    <w:pPr>
+      <w:pStyle w:val="Footer"/>
+      <w:rPr>
+        <w:lang w:val="en-US"/>
+      </w:rPr>
+    </w:pPr>
+  </w:p>
+</w:ftr>
 </file>
 
 <file path=word/footnotes.xml><?xml version="1.0" encoding="utf-8"?>
@@ -1929,6 +2100,617 @@
 </w:styles>
 </file>
 
+<file path=word/glossary/document.xml><?xml version="1.0" encoding="utf-8"?>
+<w:glossaryDocument xmlns:wpc="http://schemas.microsoft.com/office/word/2010/wordprocessingCanvas" xmlns:cx="http://schemas.microsoft.com/office/drawing/2014/chartex" xmlns:cx1="http://schemas.microsoft.com/office/drawing/2015/9/8/chartex" xmlns:cx2="http://schemas.microsoft.com/office/drawing/2015/10/21/chartex" xmlns:cx3="http://schemas.microsoft.com/office/drawing/2016/5/9/chartex" xmlns:cx4="http://schemas.microsoft.com/office/drawing/2016/5/10/chartex" xmlns:cx5="http://schemas.microsoft.com/office/drawing/2016/5/11/chartex" xmlns:cx6="http://schemas.microsoft.com/office/drawing/2016/5/12/chartex" xmlns:cx7="http://schemas.microsoft.com/office/drawing/2016/5/13/chartex" xmlns:cx8="http://schemas.microsoft.com/office/drawing/2016/5/14/chartex" xmlns:mc="http://schemas.openxmlformats.org/markup-compatibility/2006" xmlns:aink="http://schemas.microsoft.com/office/drawing/2016/ink" xmlns:am3d="http://schemas.microsoft.com/office/drawing/2017/model3d" xmlns:o="urn:schemas-microsoft-com:office:office" xmlns:oel="http://schemas.microsoft.com/office/2019/extlst" xmlns:r="http://schemas.openxmlformats.org/officeDocument/2006/relationships" xmlns:m="http://schemas.openxmlformats.org/officeDocument/2006/math" xmlns:v="urn:schemas-microsoft-com:vml" xmlns:wp14="http://schemas.microsoft.com/office/word/2010/wordprocessingDrawing" xmlns:wp="http://schemas.openxmlformats.org/drawingml/2006/wordprocessingDrawing" xmlns:w10="urn:schemas-microsoft-com:office:word" xmlns:w="http://schemas.openxmlformats.org/wordprocessingml/2006/main" xmlns:w14="http://schemas.microsoft.com/office/word/2010/wordml" xmlns:w15="http://schemas.microsoft.com/office/word/2012/wordml" xmlns:w16cex="http://schemas.microsoft.com/office/word/2018/wordml/cex" xmlns:w16cid="http://schemas.microsoft.com/office/word/2016/wordml/cid" xmlns:w16="http://schemas.microsoft.com/office/word/2018/wordml" xmlns:w16du="http://schemas.microsoft.com/office/word/2023/wordml/word16du" xmlns:w16sdtdh="http://schemas.microsoft.com/office/word/2020/wordml/sdtdatahash" xmlns:w16sdtfl="http://schemas.microsoft.com/office/word/2024/wordml/sdtformatlock" xmlns:w16se="http://schemas.microsoft.com/office/word/2015/wordml/symex" xmlns:wpg="http://schemas.microsoft.com/office/word/2010/wordprocessingGroup" xmlns:wpi="http://schemas.microsoft.com/office/word/2010/wordprocessingInk" xmlns:wne="http://schemas.microsoft.com/office/word/2006/wordml" xmlns:wps="http://schemas.microsoft.com/office/word/2010/wordprocessingShape" mc:Ignorable="w14 w15 w16se w16cid w16 w16cex w16sdtdh w16sdtfl w16du wp14">
+  <w:docParts>
+    <w:docPart>
+      <w:docPartPr>
+        <w:name w:val="F3ECC9466D38496C8C62ECC747630D9F"/>
+        <w:category>
+          <w:name w:val="General"/>
+          <w:gallery w:val="placeholder"/>
+        </w:category>
+        <w:types>
+          <w:type w:val="bbPlcHdr"/>
+        </w:types>
+        <w:behaviors>
+          <w:behavior w:val="content"/>
+        </w:behaviors>
+        <w:guid w:val="{56547AFA-4513-46FB-BD5A-6BF22493A1AE}"/>
+      </w:docPartPr>
+      <w:docPartBody>
+        <w:p>
+          <w:pPr>
+            <w:pStyle w:val="F3ECC9466D38496C8C62ECC747630D9F"/>
+          </w:pPr>
+          <w:r>
+            <w:rPr>
+              <w:caps/>
+              <w:color w:val="156082" w:themeColor="accent1"/>
+              <w:sz w:val="18"/>
+              <w:szCs w:val="18"/>
+            </w:rPr>
+            <w:t>[Document title]</w:t>
+          </w:r>
+        </w:p>
+      </w:docPartBody>
+    </w:docPart>
+    <w:docPart>
+      <w:docPartPr>
+        <w:name w:val="D111653F56F44416BC22023DDDC8FA6E"/>
+        <w:category>
+          <w:name w:val="General"/>
+          <w:gallery w:val="placeholder"/>
+        </w:category>
+        <w:types>
+          <w:type w:val="bbPlcHdr"/>
+        </w:types>
+        <w:behaviors>
+          <w:behavior w:val="content"/>
+        </w:behaviors>
+        <w:guid w:val="{A3496569-C71B-4F65-A93B-4172DCB9EA9F}"/>
+      </w:docPartPr>
+      <w:docPartBody>
+        <w:p>
+          <w:pPr>
+            <w:pStyle w:val="D111653F56F44416BC22023DDDC8FA6E"/>
+          </w:pPr>
+          <w:r>
+            <w:rPr>
+              <w:caps/>
+              <w:color w:val="156082" w:themeColor="accent1"/>
+              <w:sz w:val="18"/>
+              <w:szCs w:val="18"/>
+            </w:rPr>
+            <w:t>[Author name]</w:t>
+          </w:r>
+        </w:p>
+      </w:docPartBody>
+    </w:docPart>
+  </w:docParts>
+</w:glossaryDocument>
+</file>
+
+<file path=word/glossary/fontTable.xml><?xml version="1.0" encoding="utf-8"?>
+<w:fonts xmlns:mc="http://schemas.openxmlformats.org/markup-compatibility/2006" xmlns:r="http://schemas.openxmlformats.org/officeDocument/2006/relationships" xmlns:w="http://schemas.openxmlformats.org/wordprocessingml/2006/main" xmlns:w14="http://schemas.microsoft.com/office/word/2010/wordml" xmlns:w15="http://schemas.microsoft.com/office/word/2012/wordml" xmlns:w16cex="http://schemas.microsoft.com/office/word/2018/wordml/cex" xmlns:w16cid="http://schemas.microsoft.com/office/word/2016/wordml/cid" xmlns:w16="http://schemas.microsoft.com/office/word/2018/wordml" xmlns:w16du="http://schemas.microsoft.com/office/word/2023/wordml/word16du" xmlns:w16sdtdh="http://schemas.microsoft.com/office/word/2020/wordml/sdtdatahash" xmlns:w16sdtfl="http://schemas.microsoft.com/office/word/2024/wordml/sdtformatlock" xmlns:w16se="http://schemas.microsoft.com/office/word/2015/wordml/symex" mc:Ignorable="w14 w15 w16se w16cid w16 w16cex w16sdtdh w16sdtfl w16du">
+  <w:font w:name="Courier New">
+    <w:panose1 w:val="02070309020205020404"/>
+    <w:charset w:val="00"/>
+    <w:family w:val="modern"/>
+    <w:pitch w:val="fixed"/>
+    <w:sig w:usb0="E0002EFF" w:usb1="C0007843" w:usb2="00000009" w:usb3="00000000" w:csb0="000001FF" w:csb1="00000000"/>
+  </w:font>
+  <w:font w:name="Times New Roman">
+    <w:panose1 w:val="02020603050405020304"/>
+    <w:charset w:val="00"/>
+    <w:family w:val="roman"/>
+    <w:pitch w:val="variable"/>
+    <w:sig w:usb0="E0002EFF" w:usb1="C000785B" w:usb2="00000009" w:usb3="00000000" w:csb0="000001FF" w:csb1="00000000"/>
+  </w:font>
+  <w:font w:name="Wingdings">
+    <w:panose1 w:val="05000000000000000000"/>
+    <w:charset w:val="02"/>
+    <w:family w:val="auto"/>
+    <w:pitch w:val="variable"/>
+    <w:sig w:usb0="00000000" w:usb1="10000000" w:usb2="00000000" w:usb3="00000000" w:csb0="80000000" w:csb1="00000000"/>
+  </w:font>
+  <w:font w:name="Symbol">
+    <w:panose1 w:val="05050102010706020507"/>
+    <w:charset w:val="02"/>
+    <w:family w:val="roman"/>
+    <w:pitch w:val="variable"/>
+    <w:sig w:usb0="00000000" w:usb1="10000000" w:usb2="00000000" w:usb3="00000000" w:csb0="80000000" w:csb1="00000000"/>
+  </w:font>
+  <w:font w:name="Aptos">
+    <w:charset w:val="00"/>
+    <w:family w:val="swiss"/>
+    <w:pitch w:val="variable"/>
+    <w:sig w:usb0="20000287" w:usb1="00000003" w:usb2="00000000" w:usb3="00000000" w:csb0="0000019F" w:csb1="00000000"/>
+  </w:font>
+  <w:font w:name="Aptos Display">
+    <w:charset w:val="00"/>
+    <w:family w:val="swiss"/>
+    <w:pitch w:val="variable"/>
+    <w:sig w:usb0="20000287" w:usb1="00000003" w:usb2="00000000" w:usb3="00000000" w:csb0="0000019F" w:csb1="00000000"/>
+  </w:font>
+  <w:font w:name="Algerian">
+    <w:panose1 w:val="04020705040A02060702"/>
+    <w:charset w:val="00"/>
+    <w:family w:val="decorative"/>
+    <w:pitch w:val="variable"/>
+    <w:sig w:usb0="00000003" w:usb1="00000000" w:usb2="00000000" w:usb3="00000000" w:csb0="00000001" w:csb1="00000000"/>
+  </w:font>
+</w:fonts>
+</file>
+
+<file path=word/glossary/settings.xml><?xml version="1.0" encoding="utf-8"?>
+<w:settings xmlns:mc="http://schemas.openxmlformats.org/markup-compatibility/2006" xmlns:o="urn:schemas-microsoft-com:office:office" xmlns:r="http://schemas.openxmlformats.org/officeDocument/2006/relationships" xmlns:m="http://schemas.openxmlformats.org/officeDocument/2006/math" xmlns:v="urn:schemas-microsoft-com:vml" xmlns:w10="urn:schemas-microsoft-com:office:word" xmlns:w="http://schemas.openxmlformats.org/wordprocessingml/2006/main" xmlns:w14="http://schemas.microsoft.com/office/word/2010/wordml" xmlns:w15="http://schemas.microsoft.com/office/word/2012/wordml" xmlns:w16cex="http://schemas.microsoft.com/office/word/2018/wordml/cex" xmlns:w16cid="http://schemas.microsoft.com/office/word/2016/wordml/cid" xmlns:w16="http://schemas.microsoft.com/office/word/2018/wordml" xmlns:w16du="http://schemas.microsoft.com/office/word/2023/wordml/word16du" xmlns:w16sdtdh="http://schemas.microsoft.com/office/word/2020/wordml/sdtdatahash" xmlns:w16sdtfl="http://schemas.microsoft.com/office/word/2024/wordml/sdtformatlock" xmlns:w16se="http://schemas.microsoft.com/office/word/2015/wordml/symex" xmlns:sl="http://schemas.openxmlformats.org/schemaLibrary/2006/main" mc:Ignorable="w14 w15 w16se w16cid w16 w16cex w16sdtdh w16sdtfl w16du">
+  <w:view w:val="normal"/>
+  <w:defaultTabStop w:val="708"/>
+  <w:hyphenationZone w:val="425"/>
+  <w:characterSpacingControl w:val="doNotCompress"/>
+  <w:compat>
+    <w:useFELayout/>
+    <w:compatSetting w:name="compatibilityMode" w:uri="http://schemas.microsoft.com/office/word" w:val="15"/>
+    <w:compatSetting w:name="overrideTableStyleFontSizeAndJustification" w:uri="http://schemas.microsoft.com/office/word" w:val="1"/>
+    <w:compatSetting w:name="enableOpenTypeFeatures" w:uri="http://schemas.microsoft.com/office/word" w:val="1"/>
+    <w:compatSetting w:name="doNotFlipMirrorIndents" w:uri="http://schemas.microsoft.com/office/word" w:val="1"/>
+    <w:compatSetting w:name="differentiateMultirowTableHeaders" w:uri="http://schemas.microsoft.com/office/word" w:val="1"/>
+    <w:compatSetting w:name="useWord2013TrackBottomHyphenation" w:uri="http://schemas.microsoft.com/office/word" w:val="0"/>
+  </w:compat>
+  <w:rsids>
+    <w:rsidRoot w:val="003821C2"/>
+    <w:rsid w:val="003821C2"/>
+    <w:rsid w:val="00C24A25"/>
+    <w:rsid w:val="00CD491B"/>
+  </w:rsids>
+  <m:mathPr>
+    <m:mathFont m:val="Cambria Math"/>
+    <m:brkBin m:val="before"/>
+    <m:brkBinSub m:val="--"/>
+    <m:smallFrac m:val="0"/>
+    <m:dispDef/>
+    <m:lMargin m:val="0"/>
+    <m:rMargin m:val="0"/>
+    <m:defJc m:val="centerGroup"/>
+    <m:wrapIndent m:val="1440"/>
+    <m:intLim m:val="subSup"/>
+    <m:naryLim m:val="undOvr"/>
+  </m:mathPr>
+  <w:themeFontLang w:val="es-ES"/>
+  <w:clrSchemeMapping w:bg1="light1" w:t1="dark1" w:bg2="light2" w:t2="dark2" w:accent1="accent1" w:accent2="accent2" w:accent3="accent3" w:accent4="accent4" w:accent5="accent5" w:accent6="accent6" w:hyperlink="hyperlink" w:followedHyperlink="followedHyperlink"/>
+  <w:decimalSymbol w:val=","/>
+  <w:listSeparator w:val=";"/>
+  <w15:chartTrackingRefBased/>
+</w:settings>
+</file>
+
+<file path=word/glossary/styles.xml><?xml version="1.0" encoding="utf-8"?>
+<w:styles xmlns:mc="http://schemas.openxmlformats.org/markup-compatibility/2006" xmlns:r="http://schemas.openxmlformats.org/officeDocument/2006/relationships" xmlns:w="http://schemas.openxmlformats.org/wordprocessingml/2006/main" xmlns:w14="http://schemas.microsoft.com/office/word/2010/wordml" xmlns:w15="http://schemas.microsoft.com/office/word/2012/wordml" xmlns:w16cex="http://schemas.microsoft.com/office/word/2018/wordml/cex" xmlns:w16cid="http://schemas.microsoft.com/office/word/2016/wordml/cid" xmlns:w16="http://schemas.microsoft.com/office/word/2018/wordml" xmlns:w16du="http://schemas.microsoft.com/office/word/2023/wordml/word16du" xmlns:w16sdtdh="http://schemas.microsoft.com/office/word/2020/wordml/sdtdatahash" xmlns:w16sdtfl="http://schemas.microsoft.com/office/word/2024/wordml/sdtformatlock" xmlns:w16se="http://schemas.microsoft.com/office/word/2015/wordml/symex" mc:Ignorable="w14 w15 w16se w16cid w16 w16cex w16sdtdh w16sdtfl w16du">
+  <w:docDefaults>
+    <w:rPrDefault>
+      <w:rPr>
+        <w:rFonts w:asciiTheme="minorHAnsi" w:eastAsiaTheme="minorEastAsia" w:hAnsiTheme="minorHAnsi" w:cstheme="minorBidi"/>
+        <w:kern w:val="2"/>
+        <w:sz w:val="24"/>
+        <w:szCs w:val="24"/>
+        <w:lang w:val="es-ES" w:eastAsia="es-ES" w:bidi="ar-SA"/>
+        <w14:ligatures w14:val="standardContextual"/>
+      </w:rPr>
+    </w:rPrDefault>
+    <w:pPrDefault>
+      <w:pPr>
+        <w:spacing w:after="160" w:line="278" w:lineRule="auto"/>
+      </w:pPr>
+    </w:pPrDefault>
+  </w:docDefaults>
+  <w:latentStyles w:defLockedState="0" w:defUIPriority="99" w:defSemiHidden="0" w:defUnhideWhenUsed="0" w:defQFormat="0" w:count="376">
+    <w:lsdException w:name="Normal" w:uiPriority="0" w:qFormat="1"/>
+    <w:lsdException w:name="heading 1" w:uiPriority="9" w:qFormat="1"/>
+    <w:lsdException w:name="heading 2" w:semiHidden="1" w:uiPriority="9" w:unhideWhenUsed="1" w:qFormat="1"/>
+    <w:lsdException w:name="heading 3" w:semiHidden="1" w:uiPriority="9" w:unhideWhenUsed="1" w:qFormat="1"/>
+    <w:lsdException w:name="heading 4" w:semiHidden="1" w:uiPriority="9" w:unhideWhenUsed="1" w:qFormat="1"/>
+    <w:lsdException w:name="heading 5" w:semiHidden="1" w:uiPriority="9" w:unhideWhenUsed="1" w:qFormat="1"/>
+    <w:lsdException w:name="heading 6" w:semiHidden="1" w:uiPriority="9" w:unhideWhenUsed="1" w:qFormat="1"/>
+    <w:lsdException w:name="heading 7" w:semiHidden="1" w:uiPriority="9" w:unhideWhenUsed="1" w:qFormat="1"/>
+    <w:lsdException w:name="heading 8" w:semiHidden="1" w:uiPriority="9" w:unhideWhenUsed="1" w:qFormat="1"/>
+    <w:lsdException w:name="heading 9" w:semiHidden="1" w:uiPriority="9" w:unhideWhenUsed="1" w:qFormat="1"/>
+    <w:lsdException w:name="index 1" w:semiHidden="1" w:unhideWhenUsed="1"/>
+    <w:lsdException w:name="index 2" w:semiHidden="1" w:unhideWhenUsed="1"/>
+    <w:lsdException w:name="index 3" w:semiHidden="1" w:unhideWhenUsed="1"/>
+    <w:lsdException w:name="index 4" w:semiHidden="1" w:unhideWhenUsed="1"/>
+    <w:lsdException w:name="index 5" w:semiHidden="1" w:unhideWhenUsed="1"/>
+    <w:lsdException w:name="index 6" w:semiHidden="1" w:unhideWhenUsed="1"/>
+    <w:lsdException w:name="index 7" w:semiHidden="1" w:unhideWhenUsed="1"/>
+    <w:lsdException w:name="index 8" w:semiHidden="1" w:unhideWhenUsed="1"/>
+    <w:lsdException w:name="index 9" w:semiHidden="1" w:unhideWhenUsed="1"/>
+    <w:lsdException w:name="toc 1" w:semiHidden="1" w:uiPriority="39" w:unhideWhenUsed="1"/>
+    <w:lsdException w:name="toc 2" w:semiHidden="1" w:uiPriority="39" w:unhideWhenUsed="1"/>
+    <w:lsdException w:name="toc 3" w:semiHidden="1" w:uiPriority="39" w:unhideWhenUsed="1"/>
+    <w:lsdException w:name="toc 4" w:semiHidden="1" w:uiPriority="39" w:unhideWhenUsed="1"/>
+    <w:lsdException w:name="toc 5" w:semiHidden="1" w:uiPriority="39" w:unhideWhenUsed="1"/>
+    <w:lsdException w:name="toc 6" w:semiHidden="1" w:uiPriority="39" w:unhideWhenUsed="1"/>
+    <w:lsdException w:name="toc 7" w:semiHidden="1" w:uiPriority="39" w:unhideWhenUsed="1"/>
+    <w:lsdException w:name="toc 8" w:semiHidden="1" w:uiPriority="39" w:unhideWhenUsed="1"/>
+    <w:lsdException w:name="toc 9" w:semiHidden="1" w:uiPriority="39" w:unhideWhenUsed="1"/>
+    <w:lsdException w:name="Normal Indent" w:semiHidden="1" w:unhideWhenUsed="1"/>
+    <w:lsdException w:name="footnote text" w:semiHidden="1" w:unhideWhenUsed="1"/>
+    <w:lsdException w:name="annotation text" w:semiHidden="1" w:unhideWhenUsed="1"/>
+    <w:lsdException w:name="header" w:semiHidden="1" w:unhideWhenUsed="1"/>
+    <w:lsdException w:name="footer" w:semiHidden="1" w:unhideWhenUsed="1"/>
+    <w:lsdException w:name="index heading" w:semiHidden="1" w:unhideWhenUsed="1"/>
+    <w:lsdException w:name="caption" w:semiHidden="1" w:uiPriority="35" w:unhideWhenUsed="1" w:qFormat="1"/>
+    <w:lsdException w:name="table of figures" w:semiHidden="1" w:unhideWhenUsed="1"/>
+    <w:lsdException w:name="envelope address" w:semiHidden="1" w:unhideWhenUsed="1"/>
+    <w:lsdException w:name="envelope return" w:semiHidden="1" w:unhideWhenUsed="1"/>
+    <w:lsdException w:name="footnote reference" w:semiHidden="1" w:unhideWhenUsed="1"/>
+    <w:lsdException w:name="annotation reference" w:semiHidden="1" w:unhideWhenUsed="1"/>
+    <w:lsdException w:name="line number" w:semiHidden="1" w:unhideWhenUsed="1"/>
+    <w:lsdException w:name="page number" w:semiHidden="1" w:unhideWhenUsed="1"/>
+    <w:lsdException w:name="endnote reference" w:semiHidden="1" w:unhideWhenUsed="1"/>
+    <w:lsdException w:name="endnote text" w:semiHidden="1" w:unhideWhenUsed="1"/>
+    <w:lsdException w:name="table of authorities" w:semiHidden="1" w:unhideWhenUsed="1"/>
+    <w:lsdException w:name="macro" w:semiHidden="1" w:unhideWhenUsed="1"/>
+    <w:lsdException w:name="toa heading" w:semiHidden="1" w:unhideWhenUsed="1"/>
+    <w:lsdException w:name="List" w:semiHidden="1" w:unhideWhenUsed="1"/>
+    <w:lsdException w:name="List Bullet" w:semiHidden="1" w:unhideWhenUsed="1"/>
+    <w:lsdException w:name="List Number" w:semiHidden="1" w:unhideWhenUsed="1"/>
+    <w:lsdException w:name="List 2" w:semiHidden="1" w:unhideWhenUsed="1"/>
+    <w:lsdException w:name="List 3" w:semiHidden="1" w:unhideWhenUsed="1"/>
+    <w:lsdException w:name="List 4" w:semiHidden="1" w:unhideWhenUsed="1"/>
+    <w:lsdException w:name="List 5" w:semiHidden="1" w:unhideWhenUsed="1"/>
+    <w:lsdException w:name="List Bullet 2" w:semiHidden="1" w:unhideWhenUsed="1"/>
+    <w:lsdException w:name="List Bullet 3" w:semiHidden="1" w:unhideWhenUsed="1"/>
+    <w:lsdException w:name="List Bullet 4" w:semiHidden="1" w:unhideWhenUsed="1"/>
+    <w:lsdException w:name="List Bullet 5" w:semiHidden="1" w:unhideWhenUsed="1"/>
+    <w:lsdException w:name="List Number 2" w:semiHidden="1" w:unhideWhenUsed="1"/>
+    <w:lsdException w:name="List Number 3" w:semiHidden="1" w:unhideWhenUsed="1"/>
+    <w:lsdException w:name="List Number 4" w:semiHidden="1" w:unhideWhenUsed="1"/>
+    <w:lsdException w:name="List Number 5" w:semiHidden="1" w:unhideWhenUsed="1"/>
+    <w:lsdException w:name="Title" w:uiPriority="10" w:qFormat="1"/>
+    <w:lsdException w:name="Closing" w:semiHidden="1" w:unhideWhenUsed="1"/>
+    <w:lsdException w:name="Signature" w:semiHidden="1" w:unhideWhenUsed="1"/>
+    <w:lsdException w:name="Default Paragraph Font" w:semiHidden="1" w:uiPriority="1" w:unhideWhenUsed="1"/>
+    <w:lsdException w:name="Body Text" w:semiHidden="1" w:unhideWhenUsed="1"/>
+    <w:lsdException w:name="Body Text Indent" w:semiHidden="1" w:unhideWhenUsed="1"/>
+    <w:lsdException w:name="List Continue" w:semiHidden="1" w:unhideWhenUsed="1"/>
+    <w:lsdException w:name="List Continue 2" w:semiHidden="1" w:unhideWhenUsed="1"/>
+    <w:lsdException w:name="List Continue 3" w:semiHidden="1" w:unhideWhenUsed="1"/>
+    <w:lsdException w:name="List Continue 4" w:semiHidden="1" w:unhideWhenUsed="1"/>
+    <w:lsdException w:name="List Continue 5" w:semiHidden="1" w:unhideWhenUsed="1"/>
+    <w:lsdException w:name="Message Header" w:semiHidden="1" w:unhideWhenUsed="1"/>
+    <w:lsdException w:name="Subtitle" w:uiPriority="11" w:qFormat="1"/>
+    <w:lsdException w:name="Salutation" w:semiHidden="1" w:unhideWhenUsed="1"/>
+    <w:lsdException w:name="Date" w:semiHidden="1" w:unhideWhenUsed="1"/>
+    <w:lsdException w:name="Body Text First Indent" w:semiHidden="1" w:unhideWhenUsed="1"/>
+    <w:lsdException w:name="Body Text First Indent 2" w:semiHidden="1" w:unhideWhenUsed="1"/>
+    <w:lsdException w:name="Note Heading" w:semiHidden="1" w:unhideWhenUsed="1"/>
+    <w:lsdException w:name="Body Text 2" w:semiHidden="1" w:unhideWhenUsed="1"/>
+    <w:lsdException w:name="Body Text 3" w:semiHidden="1" w:unhideWhenUsed="1"/>
+    <w:lsdException w:name="Body Text Indent 2" w:semiHidden="1" w:unhideWhenUsed="1"/>
+    <w:lsdException w:name="Body Text Indent 3" w:semiHidden="1" w:unhideWhenUsed="1"/>
+    <w:lsdException w:name="Block Text" w:semiHidden="1" w:unhideWhenUsed="1"/>
+    <w:lsdException w:name="Hyperlink" w:semiHidden="1" w:unhideWhenUsed="1"/>
+    <w:lsdException w:name="FollowedHyperlink" w:semiHidden="1" w:unhideWhenUsed="1"/>
+    <w:lsdException w:name="Strong" w:uiPriority="22" w:qFormat="1"/>
+    <w:lsdException w:name="Emphasis" w:uiPriority="20" w:qFormat="1"/>
+    <w:lsdException w:name="Document Map" w:semiHidden="1" w:unhideWhenUsed="1"/>
+    <w:lsdException w:name="Plain Text" w:semiHidden="1" w:unhideWhenUsed="1"/>
+    <w:lsdException w:name="E-mail Signature" w:semiHidden="1" w:unhideWhenUsed="1"/>
+    <w:lsdException w:name="HTML Top of Form" w:semiHidden="1" w:unhideWhenUsed="1"/>
+    <w:lsdException w:name="HTML Bottom of Form" w:semiHidden="1" w:unhideWhenUsed="1"/>
+    <w:lsdException w:name="Normal (Web)" w:semiHidden="1" w:unhideWhenUsed="1"/>
+    <w:lsdException w:name="HTML Acronym" w:semiHidden="1" w:unhideWhenUsed="1"/>
+    <w:lsdException w:name="HTML Address" w:semiHidden="1" w:unhideWhenUsed="1"/>
+    <w:lsdException w:name="HTML Cite" w:semiHidden="1" w:unhideWhenUsed="1"/>
+    <w:lsdException w:name="HTML Code" w:semiHidden="1" w:unhideWhenUsed="1"/>
+    <w:lsdException w:name="HTML Definition" w:semiHidden="1" w:unhideWhenUsed="1"/>
+    <w:lsdException w:name="HTML Keyboard" w:semiHidden="1" w:unhideWhenUsed="1"/>
+    <w:lsdException w:name="HTML Preformatted" w:semiHidden="1" w:unhideWhenUsed="1"/>
+    <w:lsdException w:name="HTML Sample" w:semiHidden="1" w:unhideWhenUsed="1"/>
+    <w:lsdException w:name="HTML Typewriter" w:semiHidden="1" w:unhideWhenUsed="1"/>
+    <w:lsdException w:name="HTML Variable" w:semiHidden="1" w:unhideWhenUsed="1"/>
+    <w:lsdException w:name="Normal Table" w:semiHidden="1" w:unhideWhenUsed="1"/>
+    <w:lsdException w:name="annotation subject" w:semiHidden="1" w:unhideWhenUsed="1"/>
+    <w:lsdException w:name="No List" w:semiHidden="1" w:unhideWhenUsed="1"/>
+    <w:lsdException w:name="Outline List 1" w:semiHidden="1" w:unhideWhenUsed="1"/>
+    <w:lsdException w:name="Outline List 2" w:semiHidden="1" w:unhideWhenUsed="1"/>
+    <w:lsdException w:name="Outline List 3" w:semiHidden="1" w:unhideWhenUsed="1"/>
+    <w:lsdException w:name="Table Simple 1" w:semiHidden="1" w:unhideWhenUsed="1"/>
+    <w:lsdException w:name="Table Simple 2" w:semiHidden="1" w:unhideWhenUsed="1"/>
+    <w:lsdException w:name="Table Simple 3" w:semiHidden="1" w:unhideWhenUsed="1"/>
+    <w:lsdException w:name="Table Classic 1" w:semiHidden="1" w:unhideWhenUsed="1"/>
+    <w:lsdException w:name="Table Classic 2" w:semiHidden="1" w:unhideWhenUsed="1"/>
+    <w:lsdException w:name="Table Classic 3" w:semiHidden="1" w:unhideWhenUsed="1"/>
+    <w:lsdException w:name="Table Classic 4" w:semiHidden="1" w:unhideWhenUsed="1"/>
+    <w:lsdException w:name="Table Colorful 1" w:semiHidden="1" w:unhideWhenUsed="1"/>
+    <w:lsdException w:name="Table Colorful 2" w:semiHidden="1" w:unhideWhenUsed="1"/>
+    <w:lsdException w:name="Table Colorful 3" w:semiHidden="1" w:unhideWhenUsed="1"/>
+    <w:lsdException w:name="Table Columns 1" w:semiHidden="1" w:unhideWhenUsed="1"/>
+    <w:lsdException w:name="Table Columns 2" w:semiHidden="1" w:unhideWhenUsed="1"/>
+    <w:lsdException w:name="Table Columns 3" w:semiHidden="1" w:unhideWhenUsed="1"/>
+    <w:lsdException w:name="Table Columns 4" w:semiHidden="1" w:unhideWhenUsed="1"/>
+    <w:lsdException w:name="Table Columns 5" w:semiHidden="1" w:unhideWhenUsed="1"/>
+    <w:lsdException w:name="Table Grid 1" w:semiHidden="1" w:unhideWhenUsed="1"/>
+    <w:lsdException w:name="Table Grid 2" w:semiHidden="1" w:unhideWhenUsed="1"/>
+    <w:lsdException w:name="Table Grid 3" w:semiHidden="1" w:unhideWhenUsed="1"/>
+    <w:lsdException w:name="Table Grid 4" w:semiHidden="1" w:unhideWhenUsed="1"/>
+    <w:lsdException w:name="Table Grid 5" w:semiHidden="1" w:unhideWhenUsed="1"/>
+    <w:lsdException w:name="Table Grid 6" w:semiHidden="1" w:unhideWhenUsed="1"/>
+    <w:lsdException w:name="Table Grid 7" w:semiHidden="1" w:unhideWhenUsed="1"/>
+    <w:lsdException w:name="Table Grid 8" w:semiHidden="1" w:unhideWhenUsed="1"/>
+    <w:lsdException w:name="Table List 1" w:semiHidden="1" w:unhideWhenUsed="1"/>
+    <w:lsdException w:name="Table List 2" w:semiHidden="1" w:unhideWhenUsed="1"/>
+    <w:lsdException w:name="Table List 3" w:semiHidden="1" w:unhideWhenUsed="1"/>
+    <w:lsdException w:name="Table List 4" w:semiHidden="1" w:unhideWhenUsed="1"/>
+    <w:lsdException w:name="Table List 5" w:semiHidden="1" w:unhideWhenUsed="1"/>
+    <w:lsdException w:name="Table List 6" w:semiHidden="1" w:unhideWhenUsed="1"/>
+    <w:lsdException w:name="Table List 7" w:semiHidden="1" w:unhideWhenUsed="1"/>
+    <w:lsdException w:name="Table List 8" w:semiHidden="1" w:unhideWhenUsed="1"/>
+    <w:lsdException w:name="Table 3D effects 1" w:semiHidden="1" w:unhideWhenUsed="1"/>
+    <w:lsdException w:name="Table 3D effects 2" w:semiHidden="1" w:unhideWhenUsed="1"/>
+    <w:lsdException w:name="Table 3D effects 3" w:semiHidden="1" w:unhideWhenUsed="1"/>
+    <w:lsdException w:name="Table Contemporary" w:semiHidden="1" w:unhideWhenUsed="1"/>
+    <w:lsdException w:name="Table Elegant" w:semiHidden="1" w:unhideWhenUsed="1"/>
+    <w:lsdException w:name="Table Professional" w:semiHidden="1" w:unhideWhenUsed="1"/>
+    <w:lsdException w:name="Table Subtle 1" w:semiHidden="1" w:unhideWhenUsed="1"/>
+    <w:lsdException w:name="Table Subtle 2" w:semiHidden="1" w:unhideWhenUsed="1"/>
+    <w:lsdException w:name="Table Web 1" w:semiHidden="1" w:unhideWhenUsed="1"/>
+    <w:lsdException w:name="Table Web 2" w:semiHidden="1" w:unhideWhenUsed="1"/>
+    <w:lsdException w:name="Table Web 3" w:semiHidden="1" w:unhideWhenUsed="1"/>
+    <w:lsdException w:name="Balloon Text" w:semiHidden="1" w:unhideWhenUsed="1"/>
+    <w:lsdException w:name="Table Grid" w:uiPriority="39"/>
+    <w:lsdException w:name="Table Theme" w:semiHidden="1" w:unhideWhenUsed="1"/>
+    <w:lsdException w:name="Placeholder Text" w:semiHidden="1"/>
+    <w:lsdException w:name="No Spacing" w:uiPriority="1" w:qFormat="1"/>
+    <w:lsdException w:name="Light Shading" w:uiPriority="60"/>
+    <w:lsdException w:name="Light List" w:uiPriority="61"/>
+    <w:lsdException w:name="Light Grid" w:uiPriority="62"/>
+    <w:lsdException w:name="Medium Shading 1" w:uiPriority="63"/>
+    <w:lsdException w:name="Medium Shading 2" w:uiPriority="64"/>
+    <w:lsdException w:name="Medium List 1" w:uiPriority="65"/>
+    <w:lsdException w:name="Medium List 2" w:uiPriority="66"/>
+    <w:lsdException w:name="Medium Grid 1" w:uiPriority="67"/>
+    <w:lsdException w:name="Medium Grid 2" w:uiPriority="68"/>
+    <w:lsdException w:name="Medium Grid 3" w:uiPriority="69"/>
+    <w:lsdException w:name="Dark List" w:uiPriority="70"/>
+    <w:lsdException w:name="Colorful Shading" w:uiPriority="71"/>
+    <w:lsdException w:name="Colorful List" w:uiPriority="72"/>
+    <w:lsdException w:name="Colorful Grid" w:uiPriority="73"/>
+    <w:lsdException w:name="Light Shading Accent 1" w:uiPriority="60"/>
+    <w:lsdException w:name="Light List Accent 1" w:uiPriority="61"/>
+    <w:lsdException w:name="Light Grid Accent 1" w:uiPriority="62"/>
+    <w:lsdException w:name="Medium Shading 1 Accent 1" w:uiPriority="63"/>
+    <w:lsdException w:name="Medium Shading 2 Accent 1" w:uiPriority="64"/>
+    <w:lsdException w:name="Medium List 1 Accent 1" w:uiPriority="65"/>
+    <w:lsdException w:name="Revision" w:semiHidden="1"/>
+    <w:lsdException w:name="List Paragraph" w:uiPriority="34" w:qFormat="1"/>
+    <w:lsdException w:name="Quote" w:uiPriority="29" w:qFormat="1"/>
+    <w:lsdException w:name="Intense Quote" w:uiPriority="30" w:qFormat="1"/>
+    <w:lsdException w:name="Medium List 2 Accent 1" w:uiPriority="66"/>
+    <w:lsdException w:name="Medium Grid 1 Accent 1" w:uiPriority="67"/>
+    <w:lsdException w:name="Medium Grid 2 Accent 1" w:uiPriority="68"/>
+    <w:lsdException w:name="Medium Grid 3 Accent 1" w:uiPriority="69"/>
+    <w:lsdException w:name="Dark List Accent 1" w:uiPriority="70"/>
+    <w:lsdException w:name="Colorful Shading Accent 1" w:uiPriority="71"/>
+    <w:lsdException w:name="Colorful List Accent 1" w:uiPriority="72"/>
+    <w:lsdException w:name="Colorful Grid Accent 1" w:uiPriority="73"/>
+    <w:lsdException w:name="Light Shading Accent 2" w:uiPriority="60"/>
+    <w:lsdException w:name="Light List Accent 2" w:uiPriority="61"/>
+    <w:lsdException w:name="Light Grid Accent 2" w:uiPriority="62"/>
+    <w:lsdException w:name="Medium Shading 1 Accent 2" w:uiPriority="63"/>
+    <w:lsdException w:name="Medium Shading 2 Accent 2" w:uiPriority="64"/>
+    <w:lsdException w:name="Medium List 1 Accent 2" w:uiPriority="65"/>
+    <w:lsdException w:name="Medium List 2 Accent 2" w:uiPriority="66"/>
+    <w:lsdException w:name="Medium Grid 1 Accent 2" w:uiPriority="67"/>
+    <w:lsdException w:name="Medium Grid 2 Accent 2" w:uiPriority="68"/>
+    <w:lsdException w:name="Medium Grid 3 Accent 2" w:uiPriority="69"/>
+    <w:lsdException w:name="Dark List Accent 2" w:uiPriority="70"/>
+    <w:lsdException w:name="Colorful Shading Accent 2" w:uiPriority="71"/>
+    <w:lsdException w:name="Colorful List Accent 2" w:uiPriority="72"/>
+    <w:lsdException w:name="Colorful Grid Accent 2" w:uiPriority="73"/>
+    <w:lsdException w:name="Light Shading Accent 3" w:uiPriority="60"/>
+    <w:lsdException w:name="Light List Accent 3" w:uiPriority="61"/>
+    <w:lsdException w:name="Light Grid Accent 3" w:uiPriority="62"/>
+    <w:lsdException w:name="Medium Shading 1 Accent 3" w:uiPriority="63"/>
+    <w:lsdException w:name="Medium Shading 2 Accent 3" w:uiPriority="64"/>
+    <w:lsdException w:name="Medium List 1 Accent 3" w:uiPriority="65"/>
+    <w:lsdException w:name="Medium List 2 Accent 3" w:uiPriority="66"/>
+    <w:lsdException w:name="Medium Grid 1 Accent 3" w:uiPriority="67"/>
+    <w:lsdException w:name="Medium Grid 2 Accent 3" w:uiPriority="68"/>
+    <w:lsdException w:name="Medium Grid 3 Accent 3" w:uiPriority="69"/>
+    <w:lsdException w:name="Dark List Accent 3" w:uiPriority="70"/>
+    <w:lsdException w:name="Colorful Shading Accent 3" w:uiPriority="71"/>
+    <w:lsdException w:name="Colorful List Accent 3" w:uiPriority="72"/>
+    <w:lsdException w:name="Colorful Grid Accent 3" w:uiPriority="73"/>
+    <w:lsdException w:name="Light Shading Accent 4" w:uiPriority="60"/>
+    <w:lsdException w:name="Light List Accent 4" w:uiPriority="61"/>
+    <w:lsdException w:name="Light Grid Accent 4" w:uiPriority="62"/>
+    <w:lsdException w:name="Medium Shading 1 Accent 4" w:uiPriority="63"/>
+    <w:lsdException w:name="Medium Shading 2 Accent 4" w:uiPriority="64"/>
+    <w:lsdException w:name="Medium List 1 Accent 4" w:uiPriority="65"/>
+    <w:lsdException w:name="Medium List 2 Accent 4" w:uiPriority="66"/>
+    <w:lsdException w:name="Medium Grid 1 Accent 4" w:uiPriority="67"/>
+    <w:lsdException w:name="Medium Grid 2 Accent 4" w:uiPriority="68"/>
+    <w:lsdException w:name="Medium Grid 3 Accent 4" w:uiPriority="69"/>
+    <w:lsdException w:name="Dark List Accent 4" w:uiPriority="70"/>
+    <w:lsdException w:name="Colorful Shading Accent 4" w:uiPriority="71"/>
+    <w:lsdException w:name="Colorful List Accent 4" w:uiPriority="72"/>
+    <w:lsdException w:name="Colorful Grid Accent 4" w:uiPriority="73"/>
+    <w:lsdException w:name="Light Shading Accent 5" w:uiPriority="60"/>
+    <w:lsdException w:name="Light List Accent 5" w:uiPriority="61"/>
+    <w:lsdException w:name="Light Grid Accent 5" w:uiPriority="62"/>
+    <w:lsdException w:name="Medium Shading 1 Accent 5" w:uiPriority="63"/>
+    <w:lsdException w:name="Medium Shading 2 Accent 5" w:uiPriority="64"/>
+    <w:lsdException w:name="Medium List 1 Accent 5" w:uiPriority="65"/>
+    <w:lsdException w:name="Medium List 2 Accent 5" w:uiPriority="66"/>
+    <w:lsdException w:name="Medium Grid 1 Accent 5" w:uiPriority="67"/>
+    <w:lsdException w:name="Medium Grid 2 Accent 5" w:uiPriority="68"/>
+    <w:lsdException w:name="Medium Grid 3 Accent 5" w:uiPriority="69"/>
+    <w:lsdException w:name="Dark List Accent 5" w:uiPriority="70"/>
+    <w:lsdException w:name="Colorful Shading Accent 5" w:uiPriority="71"/>
+    <w:lsdException w:name="Colorful List Accent 5" w:uiPriority="72"/>
+    <w:lsdException w:name="Colorful Grid Accent 5" w:uiPriority="73"/>
+    <w:lsdException w:name="Light Shading Accent 6" w:uiPriority="60"/>
+    <w:lsdException w:name="Light List Accent 6" w:uiPriority="61"/>
+    <w:lsdException w:name="Light Grid Accent 6" w:uiPriority="62"/>
+    <w:lsdException w:name="Medium Shading 1 Accent 6" w:uiPriority="63"/>
+    <w:lsdException w:name="Medium Shading 2 Accent 6" w:uiPriority="64"/>
+    <w:lsdException w:name="Medium List 1 Accent 6" w:uiPriority="65"/>
+    <w:lsdException w:name="Medium List 2 Accent 6" w:uiPriority="66"/>
+    <w:lsdException w:name="Medium Grid 1 Accent 6" w:uiPriority="67"/>
+    <w:lsdException w:name="Medium Grid 2 Accent 6" w:uiPriority="68"/>
+    <w:lsdException w:name="Medium Grid 3 Accent 6" w:uiPriority="69"/>
+    <w:lsdException w:name="Dark List Accent 6" w:uiPriority="70"/>
+    <w:lsdException w:name="Colorful Shading Accent 6" w:uiPriority="71"/>
+    <w:lsdException w:name="Colorful List Accent 6" w:uiPriority="72"/>
+    <w:lsdException w:name="Colorful Grid Accent 6" w:uiPriority="73"/>
+    <w:lsdException w:name="Subtle Emphasis" w:uiPriority="19" w:qFormat="1"/>
+    <w:lsdException w:name="Intense Emphasis" w:uiPriority="21" w:qFormat="1"/>
+    <w:lsdException w:name="Subtle Reference" w:uiPriority="31" w:qFormat="1"/>
+    <w:lsdException w:name="Intense Reference" w:uiPriority="32" w:qFormat="1"/>
+    <w:lsdException w:name="Book Title" w:uiPriority="33" w:qFormat="1"/>
+    <w:lsdException w:name="Bibliography" w:semiHidden="1" w:uiPriority="37" w:unhideWhenUsed="1"/>
+    <w:lsdException w:name="TOC Heading" w:semiHidden="1" w:uiPriority="39" w:unhideWhenUsed="1" w:qFormat="1"/>
+    <w:lsdException w:name="Plain Table 1" w:uiPriority="41"/>
+    <w:lsdException w:name="Plain Table 2" w:uiPriority="42"/>
+    <w:lsdException w:name="Plain Table 3" w:uiPriority="43"/>
+    <w:lsdException w:name="Plain Table 4" w:uiPriority="44"/>
+    <w:lsdException w:name="Plain Table 5" w:uiPriority="45"/>
+    <w:lsdException w:name="Grid Table Light" w:uiPriority="40"/>
+    <w:lsdException w:name="Grid Table 1 Light" w:uiPriority="46"/>
+    <w:lsdException w:name="Grid Table 2" w:uiPriority="47"/>
+    <w:lsdException w:name="Grid Table 3" w:uiPriority="48"/>
+    <w:lsdException w:name="Grid Table 4" w:uiPriority="49"/>
+    <w:lsdException w:name="Grid Table 5 Dark" w:uiPriority="50"/>
+    <w:lsdException w:name="Grid Table 6 Colorful" w:uiPriority="51"/>
+    <w:lsdException w:name="Grid Table 7 Colorful" w:uiPriority="52"/>
+    <w:lsdException w:name="Grid Table 1 Light Accent 1" w:uiPriority="46"/>
+    <w:lsdException w:name="Grid Table 2 Accent 1" w:uiPriority="47"/>
+    <w:lsdException w:name="Grid Table 3 Accent 1" w:uiPriority="48"/>
+    <w:lsdException w:name="Grid Table 4 Accent 1" w:uiPriority="49"/>
+    <w:lsdException w:name="Grid Table 5 Dark Accent 1" w:uiPriority="50"/>
+    <w:lsdException w:name="Grid Table 6 Colorful Accent 1" w:uiPriority="51"/>
+    <w:lsdException w:name="Grid Table 7 Colorful Accent 1" w:uiPriority="52"/>
+    <w:lsdException w:name="Grid Table 1 Light Accent 2" w:uiPriority="46"/>
+    <w:lsdException w:name="Grid Table 2 Accent 2" w:uiPriority="47"/>
+    <w:lsdException w:name="Grid Table 3 Accent 2" w:uiPriority="48"/>
+    <w:lsdException w:name="Grid Table 4 Accent 2" w:uiPriority="49"/>
+    <w:lsdException w:name="Grid Table 5 Dark Accent 2" w:uiPriority="50"/>
+    <w:lsdException w:name="Grid Table 6 Colorful Accent 2" w:uiPriority="51"/>
+    <w:lsdException w:name="Grid Table 7 Colorful Accent 2" w:uiPriority="52"/>
+    <w:lsdException w:name="Grid Table 1 Light Accent 3" w:uiPriority="46"/>
+    <w:lsdException w:name="Grid Table 2 Accent 3" w:uiPriority="47"/>
+    <w:lsdException w:name="Grid Table 3 Accent 3" w:uiPriority="48"/>
+    <w:lsdException w:name="Grid Table 4 Accent 3" w:uiPriority="49"/>
+    <w:lsdException w:name="Grid Table 5 Dark Accent 3" w:uiPriority="50"/>
+    <w:lsdException w:name="Grid Table 6 Colorful Accent 3" w:uiPriority="51"/>
+    <w:lsdException w:name="Grid Table 7 Colorful Accent 3" w:uiPriority="52"/>
+    <w:lsdException w:name="Grid Table 1 Light Accent 4" w:uiPriority="46"/>
+    <w:lsdException w:name="Grid Table 2 Accent 4" w:uiPriority="47"/>
+    <w:lsdException w:name="Grid Table 3 Accent 4" w:uiPriority="48"/>
+    <w:lsdException w:name="Grid Table 4 Accent 4" w:uiPriority="49"/>
+    <w:lsdException w:name="Grid Table 5 Dark Accent 4" w:uiPriority="50"/>
+    <w:lsdException w:name="Grid Table 6 Colorful Accent 4" w:uiPriority="51"/>
+    <w:lsdException w:name="Grid Table 7 Colorful Accent 4" w:uiPriority="52"/>
+    <w:lsdException w:name="Grid Table 1 Light Accent 5" w:uiPriority="46"/>
+    <w:lsdException w:name="Grid Table 2 Accent 5" w:uiPriority="47"/>
+    <w:lsdException w:name="Grid Table 3 Accent 5" w:uiPriority="48"/>
+    <w:lsdException w:name="Grid Table 4 Accent 5" w:uiPriority="49"/>
+    <w:lsdException w:name="Grid Table 5 Dark Accent 5" w:uiPriority="50"/>
+    <w:lsdException w:name="Grid Table 6 Colorful Accent 5" w:uiPriority="51"/>
+    <w:lsdException w:name="Grid Table 7 Colorful Accent 5" w:uiPriority="52"/>
+    <w:lsdException w:name="Grid Table 1 Light Accent 6" w:uiPriority="46"/>
+    <w:lsdException w:name="Grid Table 2 Accent 6" w:uiPriority="47"/>
+    <w:lsdException w:name="Grid Table 3 Accent 6" w:uiPriority="48"/>
+    <w:lsdException w:name="Grid Table 4 Accent 6" w:uiPriority="49"/>
+    <w:lsdException w:name="Grid Table 5 Dark Accent 6" w:uiPriority="50"/>
+    <w:lsdException w:name="Grid Table 6 Colorful Accent 6" w:uiPriority="51"/>
+    <w:lsdException w:name="Grid Table 7 Colorful Accent 6" w:uiPriority="52"/>
+    <w:lsdException w:name="List Table 1 Light" w:uiPriority="46"/>
+    <w:lsdException w:name="List Table 2" w:uiPriority="47"/>
+    <w:lsdException w:name="List Table 3" w:uiPriority="48"/>
+    <w:lsdException w:name="List Table 4" w:uiPriority="49"/>
+    <w:lsdException w:name="List Table 5 Dark" w:uiPriority="50"/>
+    <w:lsdException w:name="List Table 6 Colorful" w:uiPriority="51"/>
+    <w:lsdException w:name="List Table 7 Colorful" w:uiPriority="52"/>
+    <w:lsdException w:name="List Table 1 Light Accent 1" w:uiPriority="46"/>
+    <w:lsdException w:name="List Table 2 Accent 1" w:uiPriority="47"/>
+    <w:lsdException w:name="List Table 3 Accent 1" w:uiPriority="48"/>
+    <w:lsdException w:name="List Table 4 Accent 1" w:uiPriority="49"/>
+    <w:lsdException w:name="List Table 5 Dark Accent 1" w:uiPriority="50"/>
+    <w:lsdException w:name="List Table 6 Colorful Accent 1" w:uiPriority="51"/>
+    <w:lsdException w:name="List Table 7 Colorful Accent 1" w:uiPriority="52"/>
+    <w:lsdException w:name="List Table 1 Light Accent 2" w:uiPriority="46"/>
+    <w:lsdException w:name="List Table 2 Accent 2" w:uiPriority="47"/>
+    <w:lsdException w:name="List Table 3 Accent 2" w:uiPriority="48"/>
+    <w:lsdException w:name="List Table 4 Accent 2" w:uiPriority="49"/>
+    <w:lsdException w:name="List Table 5 Dark Accent 2" w:uiPriority="50"/>
+    <w:lsdException w:name="List Table 6 Colorful Accent 2" w:uiPriority="51"/>
+    <w:lsdException w:name="List Table 7 Colorful Accent 2" w:uiPriority="52"/>
+    <w:lsdException w:name="List Table 1 Light Accent 3" w:uiPriority="46"/>
+    <w:lsdException w:name="List Table 2 Accent 3" w:uiPriority="47"/>
+    <w:lsdException w:name="List Table 3 Accent 3" w:uiPriority="48"/>
+    <w:lsdException w:name="List Table 4 Accent 3" w:uiPriority="49"/>
+    <w:lsdException w:name="List Table 5 Dark Accent 3" w:uiPriority="50"/>
+    <w:lsdException w:name="List Table 6 Colorful Accent 3" w:uiPriority="51"/>
+    <w:lsdException w:name="List Table 7 Colorful Accent 3" w:uiPriority="52"/>
+    <w:lsdException w:name="List Table 1 Light Accent 4" w:uiPriority="46"/>
+    <w:lsdException w:name="List Table 2 Accent 4" w:uiPriority="47"/>
+    <w:lsdException w:name="List Table 3 Accent 4" w:uiPriority="48"/>
+    <w:lsdException w:name="List Table 4 Accent 4" w:uiPriority="49"/>
+    <w:lsdException w:name="List Table 5 Dark Accent 4" w:uiPriority="50"/>
+    <w:lsdException w:name="List Table 6 Colorful Accent 4" w:uiPriority="51"/>
+    <w:lsdException w:name="List Table 7 Colorful Accent 4" w:uiPriority="52"/>
+    <w:lsdException w:name="List Table 1 Light Accent 5" w:uiPriority="46"/>
+    <w:lsdException w:name="List Table 2 Accent 5" w:uiPriority="47"/>
+    <w:lsdException w:name="List Table 3 Accent 5" w:uiPriority="48"/>
+    <w:lsdException w:name="List Table 4 Accent 5" w:uiPriority="49"/>
+    <w:lsdException w:name="List Table 5 Dark Accent 5" w:uiPriority="50"/>
+    <w:lsdException w:name="List Table 6 Colorful Accent 5" w:uiPriority="51"/>
+    <w:lsdException w:name="List Table 7 Colorful Accent 5" w:uiPriority="52"/>
+    <w:lsdException w:name="List Table 1 Light Accent 6" w:uiPriority="46"/>
+    <w:lsdException w:name="List Table 2 Accent 6" w:uiPriority="47"/>
+    <w:lsdException w:name="List Table 3 Accent 6" w:uiPriority="48"/>
+    <w:lsdException w:name="List Table 4 Accent 6" w:uiPriority="49"/>
+    <w:lsdException w:name="List Table 5 Dark Accent 6" w:uiPriority="50"/>
+    <w:lsdException w:name="List Table 6 Colorful Accent 6" w:uiPriority="51"/>
+    <w:lsdException w:name="List Table 7 Colorful Accent 6" w:uiPriority="52"/>
+    <w:lsdException w:name="Mention" w:semiHidden="1" w:unhideWhenUsed="1"/>
+    <w:lsdException w:name="Smart Hyperlink" w:semiHidden="1" w:unhideWhenUsed="1"/>
+    <w:lsdException w:name="Hashtag" w:semiHidden="1" w:unhideWhenUsed="1"/>
+    <w:lsdException w:name="Unresolved Mention" w:semiHidden="1" w:unhideWhenUsed="1"/>
+    <w:lsdException w:name="Smart Link" w:semiHidden="1" w:unhideWhenUsed="1"/>
+  </w:latentStyles>
+  <w:style w:type="paragraph" w:default="1" w:styleId="Normal">
+    <w:name w:val="Normal"/>
+    <w:qFormat/>
+  </w:style>
+  <w:style w:type="character" w:default="1" w:styleId="DefaultParagraphFont">
+    <w:name w:val="Default Paragraph Font"/>
+    <w:uiPriority w:val="1"/>
+    <w:semiHidden/>
+    <w:unhideWhenUsed/>
+  </w:style>
+  <w:style w:type="table" w:default="1" w:styleId="TableNormal">
+    <w:name w:val="Normal Table"/>
+    <w:uiPriority w:val="99"/>
+    <w:semiHidden/>
+    <w:unhideWhenUsed/>
+    <w:tblPr>
+      <w:tblInd w:w="0" w:type="dxa"/>
+      <w:tblCellMar>
+        <w:top w:w="0" w:type="dxa"/>
+        <w:left w:w="108" w:type="dxa"/>
+        <w:bottom w:w="0" w:type="dxa"/>
+        <w:right w:w="108" w:type="dxa"/>
+      </w:tblCellMar>
+    </w:tblPr>
+  </w:style>
+  <w:style w:type="numbering" w:default="1" w:styleId="NoList">
+    <w:name w:val="No List"/>
+    <w:uiPriority w:val="99"/>
+    <w:semiHidden/>
+    <w:unhideWhenUsed/>
+  </w:style>
+  <w:style w:type="paragraph" w:customStyle="1" w:styleId="F3ECC9466D38496C8C62ECC747630D9F">
+    <w:name w:val="F3ECC9466D38496C8C62ECC747630D9F"/>
+    <w:rsid w:val="003821C2"/>
+  </w:style>
+  <w:style w:type="paragraph" w:customStyle="1" w:styleId="D111653F56F44416BC22023DDDC8FA6E">
+    <w:name w:val="D111653F56F44416BC22023DDDC8FA6E"/>
+    <w:rsid w:val="003821C2"/>
+  </w:style>
+</w:styles>
+</file>
+
+<file path=word/glossary/webSettings.xml><?xml version="1.0" encoding="utf-8"?>
+<w:webSettings xmlns:mc="http://schemas.openxmlformats.org/markup-compatibility/2006" xmlns:r="http://schemas.openxmlformats.org/officeDocument/2006/relationships" xmlns:w="http://schemas.openxmlformats.org/wordprocessingml/2006/main" xmlns:w14="http://schemas.microsoft.com/office/word/2010/wordml" xmlns:w15="http://schemas.microsoft.com/office/word/2012/wordml" xmlns:w16cex="http://schemas.microsoft.com/office/word/2018/wordml/cex" xmlns:w16cid="http://schemas.microsoft.com/office/word/2016/wordml/cid" xmlns:w16="http://schemas.microsoft.com/office/word/2018/wordml" xmlns:w16du="http://schemas.microsoft.com/office/word/2023/wordml/word16du" xmlns:w16sdtdh="http://schemas.microsoft.com/office/word/2020/wordml/sdtdatahash" xmlns:w16sdtfl="http://schemas.microsoft.com/office/word/2024/wordml/sdtformatlock" xmlns:w16se="http://schemas.microsoft.com/office/word/2015/wordml/symex" mc:Ignorable="w14 w15 w16se w16cid w16 w16cex w16sdtdh w16sdtfl w16du">
+  <w:optimizeForBrowser/>
+  <w:allowPNG/>
+</w:webSettings>
+</file>
+
 <file path=word/theme/theme1.xml><?xml version="1.0" encoding="utf-8"?>
 <a:theme xmlns:a="http://schemas.openxmlformats.org/drawingml/2006/main" name="Tema de Office">
   <a:themeElements>

</xml_diff>